<commit_message>
Added reviewer responses and tracked some changes
</commit_message>
<xml_diff>
--- a/revision1/Response_Reviewer_27012026.docx
+++ b/revision1/Response_Reviewer_27012026.docx
@@ -93,25 +93,7 @@
           <w:sz w:val="24"/>
           <w:szCs w:val="24"/>
         </w:rPr>
-        <w:t xml:space="preserve">I agree with the general rationale of integrating a broad range of bioenergetic and oxidative traits to assess the effects of developmental stress on mitochondrial function. In particular, the inclusion of traits related to oxidative stress, antioxidant capacity, and redox balance is biologically meaningful, as these processes are tightly linked to mitochondrial activity and efficiency. However, I would encourage the authors to clarify the conceptual framework regarding the inclusion of plasma-based parameters, where mitochondria are not present. While circulating markers of oxidative damage or antioxidant capacity can reasonably be interpreted as systemic or downstream consequences of mitochondrial function, they are not direct measures of mitochondrial respiration or bioenergetics. Without explicit clarification, there is a risk of conflating cellular-level mitochondrial processes with organism-level outcomes. To improve conceptual clarity, I suggest that the authors explicitly distinguish </w:t>
-      </w:r>
-      <w:proofErr w:type="gramStart"/>
-      <w:r>
-        <w:rPr>
-          <w:rFonts w:ascii="Times New Roman" w:hAnsi="Times New Roman" w:cs="Times New Roman"/>
-          <w:sz w:val="24"/>
-          <w:szCs w:val="24"/>
-        </w:rPr>
-        <w:t>between:</w:t>
-      </w:r>
-      <w:proofErr w:type="gramEnd"/>
-      <w:r>
-        <w:rPr>
-          <w:rFonts w:ascii="Times New Roman" w:hAnsi="Times New Roman" w:cs="Times New Roman"/>
-          <w:sz w:val="24"/>
-          <w:szCs w:val="24"/>
-        </w:rPr>
-        <w:t xml:space="preserve"> 1) Direct mitochondrial respiratory traits (e.g. oxygen consumption, ATP-linked respiration, coupling efficiency), and 2) Systemic indicators reflecting mitochondrial stress or redox balance (e.g. plasma oxidative damage, circulating antioxidants). Making this distinction in the Methods and/or conceptual framework would strengthen the biological interpretation of the meta-analysis without requiring any changes to the analyses themselves.</w:t>
+        <w:t>I agree with the general rationale of integrating a broad range of bioenergetic and oxidative traits to assess the effects of developmental stress on mitochondrial function. In particular, the inclusion of traits related to oxidative stress, antioxidant capacity, and redox balance is biologically meaningful, as these processes are tightly linked to mitochondrial activity and efficiency. However, I would encourage the authors to clarify the conceptual framework regarding the inclusion of plasma-based parameters, where mitochondria are not present. While circulating markers of oxidative damage or antioxidant capacity can reasonably be interpreted as systemic or downstream consequences of mitochondrial function, they are not direct measures of mitochondrial respiration or bioenergetics. Without explicit clarification, there is a risk of conflating cellular-level mitochondrial processes with organism-level outcomes. To improve conceptual clarity, I suggest that the authors explicitly distinguish between: 1) Direct mitochondrial respiratory traits (e.g. oxygen consumption, ATP-linked respiration, coupling efficiency), and 2) Systemic indicators reflecting mitochondrial stress or redox balance (e.g. plasma oxidative damage, circulating antioxidants). Making this distinction in the Methods and/or conceptual framework would strengthen the biological interpretation of the meta-analysis without requiring any changes to the analyses themselves.</w:t>
       </w:r>
       <w:r>
         <w:rPr>
@@ -574,25 +556,7 @@
           <w:sz w:val="24"/>
           <w:szCs w:val="24"/>
         </w:rPr>
-        <w:t xml:space="preserve">I found the conceptual distinction between direct and indirect effects of developmental stressors on mitochondrial function somewhat unclear in the current text. While the inclusion of nutritional imbalance as a developmental stressor potentially exerting direct effects on mitochondrial function is well justified, given its immediate influence on substrate availability, the same reasoning does not appear to apply to the other stressors considered (parental care deprivation, psychological disturbance, social stress, light and noise pollution). For these stressors, I am not aware of physiological mechanisms by which they could act directly on mitochondria without mediation by organism-level </w:t>
-      </w:r>
-      <w:proofErr w:type="spellStart"/>
-      <w:r>
-        <w:rPr>
-          <w:rFonts w:ascii="Times New Roman" w:hAnsi="Times New Roman" w:cs="Times New Roman"/>
-          <w:sz w:val="24"/>
-          <w:szCs w:val="24"/>
-        </w:rPr>
-        <w:t>signaling</w:t>
-      </w:r>
-      <w:proofErr w:type="spellEnd"/>
-      <w:r>
-        <w:rPr>
-          <w:rFonts w:ascii="Times New Roman" w:hAnsi="Times New Roman" w:cs="Times New Roman"/>
-          <w:sz w:val="24"/>
-          <w:szCs w:val="24"/>
-        </w:rPr>
-        <w:t xml:space="preserve"> pathways. In vertebrates, changes in mitochondrial function in response to such stressors are typically understood to arise indirectly, through neuroendocrine and metabolic regulation (e.g. long-term programming of the HPA/HPI axis and glucocorticoid secretion), rather than through direct action of the stressor on mitochondria themselves. Truly direct effects on mitochondria are more plausibly expected in cases such as exposure to toxicants, hypoxia, or extreme temperatures, which can directly interfere with mitochondrial membranes, electron transport, or oxygen availability. I therefore suggest clarifying this conceptual distinction in the manuscript, explicitly separating stressors that may plausibly influence mitochondrial function via direct pathways (nutritional imbalance) from those whose effects are more likely mediated indirectly through endocrine regulatory processes. This clarification would strengthen the physiological interpretation of the meta-analysis.</w:t>
+        <w:t>I found the conceptual distinction between direct and indirect effects of developmental stressors on mitochondrial function somewhat unclear in the current text. While the inclusion of nutritional imbalance as a developmental stressor potentially exerting direct effects on mitochondrial function is well justified, given its immediate influence on substrate availability, the same reasoning does not appear to apply to the other stressors considered (parental care deprivation, psychological disturbance, social stress, light and noise pollution). For these stressors, I am not aware of physiological mechanisms by which they could act directly on mitochondria without mediation by organism-level signaling pathways. In vertebrates, changes in mitochondrial function in response to such stressors are typically understood to arise indirectly, through neuroendocrine and metabolic regulation (e.g. long-term programming of the HPA/HPI axis and glucocorticoid secretion), rather than through direct action of the stressor on mitochondria themselves. Truly direct effects on mitochondria are more plausibly expected in cases such as exposure to toxicants, hypoxia, or extreme temperatures, which can directly interfere with mitochondrial membranes, electron transport, or oxygen availability. I therefore suggest clarifying this conceptual distinction in the manuscript, explicitly separating stressors that may plausibly influence mitochondrial function via direct pathways (nutritional imbalance) from those whose effects are more likely mediated indirectly through endocrine regulatory processes. This clarification would strengthen the physiological interpretation of the meta-analysis.</w:t>
       </w:r>
       <w:r>
         <w:rPr>
@@ -780,61 +744,7 @@
           <w:sz w:val="24"/>
           <w:szCs w:val="24"/>
         </w:rPr>
-        <w:t xml:space="preserve">In relation to the previous point, I suggest considering whether developmental stressors could be grouped according to their most likely underlying physiological pathways in the statistical analysis. </w:t>
-      </w:r>
-      <w:proofErr w:type="gramStart"/>
-      <w:r>
-        <w:rPr>
-          <w:rFonts w:ascii="Times New Roman" w:hAnsi="Times New Roman" w:cs="Times New Roman"/>
-          <w:sz w:val="24"/>
-          <w:szCs w:val="24"/>
-        </w:rPr>
-        <w:t>In particular, stressors</w:t>
-      </w:r>
-      <w:proofErr w:type="gramEnd"/>
-      <w:r>
-        <w:rPr>
-          <w:rFonts w:ascii="Times New Roman" w:hAnsi="Times New Roman" w:cs="Times New Roman"/>
-          <w:sz w:val="24"/>
-          <w:szCs w:val="24"/>
-        </w:rPr>
-        <w:t xml:space="preserve"> that are primarily mediated through activation or programming of the HPA/HPI axis (including experimental glucocorticoid administration, social stress, parental care deprivation, and psychological disturbance) could potentially be pooled and </w:t>
-      </w:r>
-      <w:proofErr w:type="spellStart"/>
-      <w:r>
-        <w:rPr>
-          <w:rFonts w:ascii="Times New Roman" w:hAnsi="Times New Roman" w:cs="Times New Roman"/>
-          <w:sz w:val="24"/>
-          <w:szCs w:val="24"/>
-        </w:rPr>
-        <w:t>analyzed</w:t>
-      </w:r>
-      <w:proofErr w:type="spellEnd"/>
-      <w:r>
-        <w:rPr>
-          <w:rFonts w:ascii="Times New Roman" w:hAnsi="Times New Roman" w:cs="Times New Roman"/>
-          <w:sz w:val="24"/>
-          <w:szCs w:val="24"/>
-        </w:rPr>
-        <w:t xml:space="preserve"> together, while nutritional imbalance could be retained as a separate category given its more direct metabolic effects on mitochondrial function. Such a grouping may help increase statistical power and improve interpretability, especially for stressors that are currently represented by a very small number of studies when </w:t>
-      </w:r>
-      <w:proofErr w:type="spellStart"/>
-      <w:r>
-        <w:rPr>
-          <w:rFonts w:ascii="Times New Roman" w:hAnsi="Times New Roman" w:cs="Times New Roman"/>
-          <w:sz w:val="24"/>
-          <w:szCs w:val="24"/>
-        </w:rPr>
-        <w:t>analyzed</w:t>
-      </w:r>
-      <w:proofErr w:type="spellEnd"/>
-      <w:r>
-        <w:rPr>
-          <w:rFonts w:ascii="Times New Roman" w:hAnsi="Times New Roman" w:cs="Times New Roman"/>
-          <w:sz w:val="24"/>
-          <w:szCs w:val="24"/>
-        </w:rPr>
-        <w:t xml:space="preserve"> separately. For example, in the current analysis of glucocorticoid exposure (Fig. 6), the dataset includes only one study in fish and three in birds, which limits the strength of inference that can be drawn. Pooling stressors that share a common endocrine mechanism could therefore provide a more robust test of the hypothesis that developmental stress mediated by the HPA/HPI axis has consistent effects on mitochondrial function.</w:t>
+        <w:t>In relation to the previous point, I suggest considering whether developmental stressors could be grouped according to their most likely underlying physiological pathways in the statistical analysis. In particular, stressors that are primarily mediated through activation or programming of the HPA/HPI axis (including experimental glucocorticoid administration, social stress, parental care deprivation, and psychological disturbance) could potentially be pooled and analyzed together, while nutritional imbalance could be retained as a separate category given its more direct metabolic effects on mitochondrial function. Such a grouping may help increase statistical power and improve interpretability, especially for stressors that are currently represented by a very small number of studies when analyzed separately. For example, in the current analysis of glucocorticoid exposure (Fig. 6), the dataset includes only one study in fish and three in birds, which limits the strength of inference that can be drawn. Pooling stressors that share a common endocrine mechanism could therefore provide a more robust test of the hypothesis that developmental stress mediated by the HPA/HPI axis has consistent effects on mitochondrial function.</w:t>
       </w:r>
       <w:r>
         <w:rPr>
@@ -871,27 +781,7 @@
           <w:sz w:val="24"/>
           <w:szCs w:val="24"/>
         </w:rPr>
-        <w:t xml:space="preserve">Programming of the HPA/I axis has been shown to occur across taxa and in response to a several types of developmental stressors (e.g., glucocorticoid exposure, predator </w:t>
-      </w:r>
-      <w:proofErr w:type="gramStart"/>
-      <w:r>
-        <w:rPr>
-          <w:rFonts w:ascii="Times New Roman" w:hAnsi="Times New Roman" w:cs="Times New Roman"/>
-          <w:color w:val="0070C0"/>
-          <w:sz w:val="24"/>
-          <w:szCs w:val="24"/>
-        </w:rPr>
-        <w:t>exposure;  reviewed</w:t>
-      </w:r>
-      <w:proofErr w:type="gramEnd"/>
-      <w:r>
-        <w:rPr>
-          <w:rFonts w:ascii="Times New Roman" w:hAnsi="Times New Roman" w:cs="Times New Roman"/>
-          <w:color w:val="0070C0"/>
-          <w:sz w:val="24"/>
-          <w:szCs w:val="24"/>
-        </w:rPr>
-        <w:t xml:space="preserve"> in Matthews and McGowan 2019). However, developmental stressors do not always result in programmatic effects of the HPA/I axis</w:t>
+        <w:t>Programming of the HPA/I axis has been shown to occur across taxa and in response to a several types of developmental stressors (e.g., glucocorticoid exposure, predator exposure;  reviewed in Matthews and McGowan 2019). However, developmental stressors do not always result in programmatic effects of the HPA/I axis</w:t>
       </w:r>
       <w:r>
         <w:rPr>
@@ -1311,47 +1201,7 @@
           <w:sz w:val="24"/>
           <w:szCs w:val="24"/>
         </w:rPr>
-        <w:t xml:space="preserve">Marasco, V., Robinson, J., </w:t>
-      </w:r>
-      <w:proofErr w:type="spellStart"/>
-      <w:r>
-        <w:rPr>
-          <w:rFonts w:ascii="Times New Roman" w:hAnsi="Times New Roman" w:cs="Times New Roman"/>
-          <w:color w:val="0070C0"/>
-          <w:sz w:val="24"/>
-          <w:szCs w:val="24"/>
-        </w:rPr>
-        <w:t>Herzyk</w:t>
-      </w:r>
-      <w:proofErr w:type="spellEnd"/>
-      <w:r>
-        <w:rPr>
-          <w:rFonts w:ascii="Times New Roman" w:hAnsi="Times New Roman" w:cs="Times New Roman"/>
-          <w:color w:val="0070C0"/>
-          <w:sz w:val="24"/>
-          <w:szCs w:val="24"/>
-        </w:rPr>
-        <w:t xml:space="preserve">, P., Spencer, K.A. (2012) </w:t>
-      </w:r>
-      <w:proofErr w:type="gramStart"/>
-      <w:r>
-        <w:rPr>
-          <w:rFonts w:ascii="Times New Roman" w:hAnsi="Times New Roman" w:cs="Times New Roman"/>
-          <w:color w:val="0070C0"/>
-          <w:sz w:val="24"/>
-          <w:szCs w:val="24"/>
-        </w:rPr>
-        <w:t>Pre- and</w:t>
-      </w:r>
-      <w:proofErr w:type="gramEnd"/>
-      <w:r>
-        <w:rPr>
-          <w:rFonts w:ascii="Times New Roman" w:hAnsi="Times New Roman" w:cs="Times New Roman"/>
-          <w:color w:val="0070C0"/>
-          <w:sz w:val="24"/>
-          <w:szCs w:val="24"/>
-        </w:rPr>
-        <w:t xml:space="preserve"> post-natal stress in context: effects on the stress physiology in a precocial bird. </w:t>
+        <w:t xml:space="preserve">Marasco, V., Robinson, J., Herzyk, P., Spencer, K.A. (2012) Pre- and post-natal stress in context: effects on the stress physiology in a precocial bird. </w:t>
       </w:r>
       <w:r>
         <w:rPr>
@@ -1708,7 +1558,6 @@
           <w:rFonts w:ascii="Times New Roman" w:hAnsi="Times New Roman" w:cs="Times New Roman"/>
           <w:sz w:val="24"/>
           <w:szCs w:val="24"/>
-          <w:highlight w:val="green"/>
         </w:rPr>
         <w:t xml:space="preserve">6) </w:t>
       </w:r>
@@ -1717,29 +1566,8 @@
           <w:rFonts w:ascii="Times New Roman" w:hAnsi="Times New Roman" w:cs="Times New Roman"/>
           <w:sz w:val="24"/>
           <w:szCs w:val="24"/>
-          <w:highlight w:val="green"/>
-        </w:rPr>
-        <w:t xml:space="preserve">I could not find a clear description in the Methods explaining how the authors defined or interpreted an effect as “significant.” I suggest clarifying the inferential framework emphasizing a bit more the use of effect sizes and their associated uncertainty (e.g. credible intervals) as the primary basis for interpretation. </w:t>
-      </w:r>
-      <w:proofErr w:type="gramStart"/>
-      <w:r>
-        <w:rPr>
-          <w:rFonts w:ascii="Times New Roman" w:hAnsi="Times New Roman" w:cs="Times New Roman"/>
-          <w:sz w:val="24"/>
-          <w:szCs w:val="24"/>
-          <w:highlight w:val="green"/>
-        </w:rPr>
-        <w:t>In particular, focusing</w:t>
-      </w:r>
-      <w:proofErr w:type="gramEnd"/>
-      <w:r>
-        <w:rPr>
-          <w:rFonts w:ascii="Times New Roman" w:hAnsi="Times New Roman" w:cs="Times New Roman"/>
-          <w:sz w:val="24"/>
-          <w:szCs w:val="24"/>
-          <w:highlight w:val="green"/>
-        </w:rPr>
-        <w:t xml:space="preserve"> on the magnitude and direction of effects, and on whether credible intervals overlap zero, would provide a more transparent and biologically meaningful assessment than dichotomous significance testing. This approach would also reduce concerns related to multiple testing.</w:t>
+        </w:rPr>
+        <w:t>I could not find a clear description in the Methods explaining how the authors defined or interpreted an effect as “significant.” I suggest clarifying the inferential framework emphasizing a bit more the use of effect sizes and their associated uncertainty (e.g. credible intervals) as the primary basis for interpretation. In particular, focusing on the magnitude and direction of effects, and on whether credible intervals overlap zero, would provide a more transparent and biologically meaningful assessment than dichotomous significance testing. This approach would also reduce concerns related to multiple testing.</w:t>
       </w:r>
       <w:r>
         <w:rPr>
@@ -1755,18 +1583,38 @@
         <w:spacing w:after="0"/>
         <w:rPr>
           <w:rFonts w:ascii="Times New Roman" w:hAnsi="Times New Roman" w:cs="Times New Roman"/>
-          <w:sz w:val="24"/>
-          <w:szCs w:val="24"/>
-        </w:rPr>
-      </w:pPr>
+          <w:color w:val="0070C0"/>
+          <w:sz w:val="24"/>
+          <w:szCs w:val="24"/>
+        </w:rPr>
+      </w:pPr>
+      <w:r>
+        <w:rPr>
+          <w:rFonts w:ascii="Times New Roman" w:hAnsi="Times New Roman" w:cs="Times New Roman"/>
+          <w:color w:val="0070C0"/>
+          <w:sz w:val="24"/>
+          <w:szCs w:val="24"/>
+        </w:rPr>
+        <w:t>We agree</w:t>
+      </w:r>
+      <w:r>
+        <w:rPr>
+          <w:rFonts w:ascii="Times New Roman" w:hAnsi="Times New Roman" w:cs="Times New Roman"/>
+          <w:color w:val="0070C0"/>
+          <w:sz w:val="24"/>
+          <w:szCs w:val="24"/>
+        </w:rPr>
+        <w:t xml:space="preserve">, though whether using CI’s or p-values for inferences made little </w:t>
+      </w:r>
       <w:commentRangeStart w:id="0"/>
       <w:r>
         <w:rPr>
           <w:rFonts w:ascii="Times New Roman" w:hAnsi="Times New Roman" w:cs="Times New Roman"/>
-          <w:sz w:val="24"/>
-          <w:szCs w:val="24"/>
-        </w:rPr>
-        <w:t>Dan</w:t>
+          <w:color w:val="0070C0"/>
+          <w:sz w:val="24"/>
+          <w:szCs w:val="24"/>
+        </w:rPr>
+        <w:t xml:space="preserve">difference. </w:t>
       </w:r>
       <w:commentRangeEnd w:id="0"/>
       <w:r>
@@ -1775,6 +1623,90 @@
         </w:rPr>
         <w:commentReference w:id="0"/>
       </w:r>
+      <w:r>
+        <w:rPr>
+          <w:rFonts w:ascii="Times New Roman" w:hAnsi="Times New Roman" w:cs="Times New Roman"/>
+          <w:color w:val="0070C0"/>
+          <w:sz w:val="24"/>
+          <w:szCs w:val="24"/>
+        </w:rPr>
+        <w:t>Nonetheless, this should have been clear. We have now added the following sentence to section 3: “</w:t>
+      </w:r>
+      <w:r>
+        <w:rPr>
+          <w:rFonts w:ascii="Times New Roman" w:hAnsi="Times New Roman" w:cs="Times New Roman"/>
+          <w:i/>
+          <w:iCs/>
+          <w:color w:val="0070C0"/>
+          <w:sz w:val="24"/>
+          <w:szCs w:val="24"/>
+        </w:rPr>
+        <w:t xml:space="preserve">For all inferential tests, we consider mean effects being significantly different from zero when confidence intervals </w:t>
+      </w:r>
+      <w:r>
+        <w:rPr>
+          <w:rFonts w:ascii="Times New Roman" w:hAnsi="Times New Roman" w:cs="Times New Roman"/>
+          <w:i/>
+          <w:iCs/>
+          <w:color w:val="0070C0"/>
+          <w:sz w:val="24"/>
+          <w:szCs w:val="24"/>
+        </w:rPr>
+        <w:t>did</w:t>
+      </w:r>
+      <w:r>
+        <w:rPr>
+          <w:rFonts w:ascii="Times New Roman" w:hAnsi="Times New Roman" w:cs="Times New Roman"/>
+          <w:i/>
+          <w:iCs/>
+          <w:color w:val="0070C0"/>
+          <w:sz w:val="24"/>
+          <w:szCs w:val="24"/>
+        </w:rPr>
+        <w:t xml:space="preserve"> not overlap zero </w:t>
+      </w:r>
+      <w:r>
+        <w:rPr>
+          <w:rFonts w:ascii="Times New Roman" w:hAnsi="Times New Roman" w:cs="Times New Roman"/>
+          <w:i/>
+          <w:iCs/>
+          <w:color w:val="0070C0"/>
+          <w:sz w:val="24"/>
+          <w:szCs w:val="24"/>
+        </w:rPr>
+        <w:t>and/</w:t>
+      </w:r>
+      <w:r>
+        <w:rPr>
+          <w:rFonts w:ascii="Times New Roman" w:hAnsi="Times New Roman" w:cs="Times New Roman"/>
+          <w:i/>
+          <w:iCs/>
+          <w:color w:val="0070C0"/>
+          <w:sz w:val="24"/>
+          <w:szCs w:val="24"/>
+        </w:rPr>
+        <w:t>or when p &lt; 0.05</w:t>
+      </w:r>
+      <w:r>
+        <w:rPr>
+          <w:rFonts w:ascii="Times New Roman" w:hAnsi="Times New Roman" w:cs="Times New Roman"/>
+          <w:i/>
+          <w:iCs/>
+          <w:color w:val="0070C0"/>
+          <w:sz w:val="24"/>
+          <w:szCs w:val="24"/>
+        </w:rPr>
+        <w:t>.</w:t>
+      </w:r>
+      <w:r>
+        <w:rPr>
+          <w:rFonts w:ascii="Times New Roman" w:hAnsi="Times New Roman" w:cs="Times New Roman"/>
+          <w:color w:val="0070C0"/>
+          <w:sz w:val="24"/>
+          <w:szCs w:val="24"/>
+        </w:rPr>
+        <w:t>”</w:t>
+      </w:r>
     </w:p>
     <w:p>
       <w:pPr>
@@ -1809,25 +1741,7 @@
           <w:sz w:val="24"/>
           <w:szCs w:val="24"/>
         </w:rPr>
-        <w:t xml:space="preserve">690: I like this part of the </w:t>
-      </w:r>
-      <w:proofErr w:type="gramStart"/>
-      <w:r>
-        <w:rPr>
-          <w:rFonts w:ascii="Times New Roman" w:hAnsi="Times New Roman" w:cs="Times New Roman"/>
-          <w:sz w:val="24"/>
-          <w:szCs w:val="24"/>
-        </w:rPr>
-        <w:t>discussion</w:t>
-      </w:r>
-      <w:proofErr w:type="gramEnd"/>
-      <w:r>
-        <w:rPr>
-          <w:rFonts w:ascii="Times New Roman" w:hAnsi="Times New Roman" w:cs="Times New Roman"/>
-          <w:sz w:val="24"/>
-          <w:szCs w:val="24"/>
-        </w:rPr>
-        <w:t xml:space="preserve"> but this sentence represents a mammalian point of view. Endocrine dynamics in birds and fish are frequently highly seasonal or context-dependent in both sexes, and males can show substantial hormonal variability. Given the taxonomic breadth of the meta-analysis, it may be useful to qualify this statement or restrict it to mammals, to avoid overgeneralization.</w:t>
+        <w:t>690: I like this part of the discussion but this sentence represents a mammalian point of view. Endocrine dynamics in birds and fish are frequently highly seasonal or context-dependent in both sexes, and males can show substantial hormonal variability. Given the taxonomic breadth of the meta-analysis, it may be useful to qualify this statement or restrict it to mammals, to avoid overgeneralization.</w:t>
       </w:r>
       <w:r>
         <w:rPr>
@@ -2233,7 +2147,17 @@
           <w:sz w:val="24"/>
           <w:szCs w:val="24"/>
         </w:rPr>
-        <w:t xml:space="preserve">constructive comments. We agree that a meta-analysis testing the effects of developmental conditions on mitochondrial function in invertebrates would be interesting and timely. We chose to focus on vertebrates but think there is ample scope </w:t>
+        <w:t xml:space="preserve">constructive comments. We agree that a meta-analysis testing the effects of developmental conditions on </w:t>
+      </w:r>
+      <w:r>
+        <w:rPr>
+          <w:rFonts w:ascii="Times New Roman" w:hAnsi="Times New Roman" w:cs="Times New Roman"/>
+          <w:color w:val="0070C0"/>
+          <w:sz w:val="24"/>
+          <w:szCs w:val="24"/>
+        </w:rPr>
+        <w:lastRenderedPageBreak/>
+        <w:t xml:space="preserve">mitochondrial function in invertebrates would be interesting and timely. We chose to focus on vertebrates but think there is ample scope </w:t>
       </w:r>
       <w:r>
         <w:rPr>
@@ -2517,25 +2441,7 @@
           <w:sz w:val="24"/>
           <w:szCs w:val="24"/>
         </w:rPr>
-        <w:t xml:space="preserve">paragraph 3: it would be worth pointing out the recent call for a redefinition of "function and dysfunction" in mitochondrial physiology - see Monzel et al 2023 https://www.nature.com/articles/s42255-023-00783-1 </w:t>
-      </w:r>
-      <w:proofErr w:type="gramStart"/>
-      <w:r>
-        <w:rPr>
-          <w:rFonts w:ascii="Times New Roman" w:hAnsi="Times New Roman" w:cs="Times New Roman"/>
-          <w:sz w:val="24"/>
-          <w:szCs w:val="24"/>
-        </w:rPr>
-        <w:t>Good</w:t>
-      </w:r>
-      <w:proofErr w:type="gramEnd"/>
-      <w:r>
-        <w:rPr>
-          <w:rFonts w:ascii="Times New Roman" w:hAnsi="Times New Roman" w:cs="Times New Roman"/>
-          <w:sz w:val="24"/>
-          <w:szCs w:val="24"/>
-        </w:rPr>
-        <w:t xml:space="preserve"> box and disclaimer about complexity of mt function.</w:t>
+        <w:t>paragraph 3: it would be worth pointing out the recent call for a redefinition of "function and dysfunction" in mitochondrial physiology - see Monzel et al 2023 https://www.nature.com/articles/s42255-023-00783-1 Good box and disclaimer about complexity of mt function.</w:t>
       </w:r>
       <w:r>
         <w:rPr>
@@ -2990,9 +2896,29 @@
           <w:rFonts w:ascii="Times New Roman" w:hAnsi="Times New Roman" w:cs="Times New Roman"/>
           <w:sz w:val="24"/>
           <w:szCs w:val="24"/>
+        </w:rPr>
+      </w:pPr>
+      <w:r>
+        <w:rPr>
+          <w:rFonts w:ascii="Times New Roman" w:hAnsi="Times New Roman" w:cs="Times New Roman"/>
+          <w:sz w:val="24"/>
+          <w:szCs w:val="24"/>
+        </w:rPr>
+        <w:t xml:space="preserve">There is some overlapping title text (in fig 5 too), but it might due to the review system's formatting. I also don't understand where the raw data is shown? For both figs, is there a way to perhaps show significance (as reported in the text)? And also show publication bias significance where applicable (psychological disturbance)? </w:t>
+      </w:r>
+    </w:p>
+    <w:p>
+      <w:pPr>
+        <w:spacing w:after="0"/>
+        <w:rPr>
+          <w:rFonts w:ascii="Times New Roman" w:hAnsi="Times New Roman" w:cs="Times New Roman"/>
+          <w:sz w:val="24"/>
+          <w:szCs w:val="24"/>
           <w:highlight w:val="green"/>
         </w:rPr>
       </w:pPr>
+      <w:commentRangeStart w:id="1"/>
+      <w:commentRangeStart w:id="2"/>
       <w:r>
         <w:rPr>
           <w:rFonts w:ascii="Times New Roman" w:hAnsi="Times New Roman" w:cs="Times New Roman"/>
@@ -3000,29 +2926,284 @@
           <w:szCs w:val="24"/>
           <w:highlight w:val="green"/>
         </w:rPr>
-        <w:t xml:space="preserve">There is some overlapping title text (in fig 5 too), but it </w:t>
-      </w:r>
-      <w:proofErr w:type="gramStart"/>
-      <w:r>
+        <w:lastRenderedPageBreak/>
+        <w:t>Dan</w:t>
+      </w:r>
+      <w:commentRangeEnd w:id="1"/>
+      <w:r>
+        <w:rPr>
+          <w:rStyle w:val="CommentReference"/>
+        </w:rPr>
+        <w:commentReference w:id="1"/>
+      </w:r>
+      <w:commentRangeEnd w:id="2"/>
+      <w:r>
+        <w:rPr>
+          <w:rStyle w:val="CommentReference"/>
+        </w:rPr>
+        <w:commentReference w:id="2"/>
+      </w:r>
+    </w:p>
+    <w:p>
+      <w:pPr>
+        <w:spacing w:after="0"/>
+        <w:rPr>
+          <w:rFonts w:ascii="Times New Roman" w:hAnsi="Times New Roman" w:cs="Times New Roman"/>
+          <w:color w:val="0070C0"/>
+          <w:sz w:val="24"/>
+          <w:szCs w:val="24"/>
+        </w:rPr>
+      </w:pPr>
+      <w:r>
+        <w:rPr>
+          <w:rFonts w:ascii="Times New Roman" w:hAnsi="Times New Roman" w:cs="Times New Roman"/>
+          <w:color w:val="0070C0"/>
+          <w:sz w:val="24"/>
+          <w:szCs w:val="24"/>
+        </w:rPr>
+        <w:t>Thanks. We have</w:t>
+      </w:r>
+      <w:r>
+        <w:rPr>
+          <w:rFonts w:ascii="Times New Roman" w:hAnsi="Times New Roman" w:cs="Times New Roman"/>
+          <w:color w:val="0070C0"/>
+          <w:sz w:val="24"/>
+          <w:szCs w:val="24"/>
+        </w:rPr>
+        <w:t xml:space="preserve"> fixed the figures and manuscript as follows:</w:t>
+      </w:r>
+    </w:p>
+    <w:p>
+      <w:pPr>
+        <w:pStyle w:val="ListParagraph"/>
+        <w:numPr>
+          <w:ilvl w:val="0"/>
+          <w:numId w:val="1"/>
+        </w:numPr>
+        <w:spacing w:after="0"/>
+        <w:rPr>
+          <w:rFonts w:ascii="Times New Roman" w:hAnsi="Times New Roman" w:cs="Times New Roman"/>
+          <w:color w:val="0070C0"/>
+          <w:sz w:val="24"/>
+          <w:szCs w:val="24"/>
+        </w:rPr>
+      </w:pPr>
+      <w:r>
+        <w:rPr>
+          <w:rFonts w:ascii="Times New Roman" w:hAnsi="Times New Roman" w:cs="Times New Roman"/>
+          <w:color w:val="0070C0"/>
+          <w:sz w:val="24"/>
+          <w:szCs w:val="24"/>
+        </w:rPr>
+        <w:t>C</w:t>
+      </w:r>
+      <w:r>
+        <w:rPr>
+          <w:rFonts w:ascii="Times New Roman" w:hAnsi="Times New Roman" w:cs="Times New Roman"/>
+          <w:color w:val="0070C0"/>
+          <w:sz w:val="24"/>
+          <w:szCs w:val="24"/>
+        </w:rPr>
+        <w:t xml:space="preserve">hecked to ensure that there is no overlapping text on our figures and corrected these now. </w:t>
+      </w:r>
+    </w:p>
+    <w:p>
+      <w:pPr>
+        <w:pStyle w:val="ListParagraph"/>
+        <w:numPr>
+          <w:ilvl w:val="0"/>
+          <w:numId w:val="1"/>
+        </w:numPr>
+        <w:spacing w:after="0"/>
+        <w:rPr>
+          <w:rFonts w:ascii="Times New Roman" w:hAnsi="Times New Roman" w:cs="Times New Roman"/>
+          <w:color w:val="0070C0"/>
+          <w:sz w:val="24"/>
+          <w:szCs w:val="24"/>
+        </w:rPr>
+      </w:pPr>
+      <w:r>
+        <w:rPr>
+          <w:rFonts w:ascii="Times New Roman" w:hAnsi="Times New Roman" w:cs="Times New Roman"/>
+          <w:color w:val="0070C0"/>
+          <w:sz w:val="24"/>
+          <w:szCs w:val="24"/>
+        </w:rPr>
+        <w:t>The raw data is shown as the transparent points behind the mean estimates.</w:t>
+      </w:r>
+      <w:r>
+        <w:rPr>
+          <w:rFonts w:ascii="Times New Roman" w:hAnsi="Times New Roman" w:cs="Times New Roman"/>
+          <w:color w:val="0070C0"/>
+          <w:sz w:val="24"/>
+          <w:szCs w:val="24"/>
+        </w:rPr>
+        <w:t xml:space="preserve"> We’ve adjusted the legend now to make this clearer.</w:t>
+      </w:r>
+      <w:r>
+        <w:rPr>
+          <w:rFonts w:ascii="Times New Roman" w:hAnsi="Times New Roman" w:cs="Times New Roman"/>
+          <w:color w:val="0070C0"/>
+          <w:sz w:val="24"/>
+          <w:szCs w:val="24"/>
+        </w:rPr>
+        <w:t xml:space="preserve"> </w:t>
+      </w:r>
+    </w:p>
+    <w:p>
+      <w:pPr>
+        <w:pStyle w:val="ListParagraph"/>
+        <w:numPr>
+          <w:ilvl w:val="0"/>
+          <w:numId w:val="1"/>
+        </w:numPr>
+        <w:spacing w:after="0"/>
+        <w:rPr>
+          <w:rFonts w:ascii="Times New Roman" w:hAnsi="Times New Roman" w:cs="Times New Roman"/>
+          <w:color w:val="0070C0"/>
+          <w:sz w:val="24"/>
+          <w:szCs w:val="24"/>
+        </w:rPr>
+      </w:pPr>
+      <w:r>
+        <w:rPr>
+          <w:rFonts w:ascii="Times New Roman" w:hAnsi="Times New Roman" w:cs="Times New Roman"/>
+          <w:color w:val="0070C0"/>
+          <w:sz w:val="24"/>
+          <w:szCs w:val="24"/>
+        </w:rPr>
+        <w:t>Adding the p-values to figures is a good suggestion. We have done that for all figures now.</w:t>
+      </w:r>
+    </w:p>
+    <w:p>
+      <w:pPr>
+        <w:pStyle w:val="ListParagraph"/>
+        <w:numPr>
+          <w:ilvl w:val="0"/>
+          <w:numId w:val="1"/>
+        </w:numPr>
+        <w:spacing w:after="0"/>
+        <w:rPr>
+          <w:rFonts w:ascii="Times New Roman" w:hAnsi="Times New Roman" w:cs="Times New Roman"/>
+          <w:color w:val="0070C0"/>
+          <w:sz w:val="24"/>
+          <w:szCs w:val="24"/>
+        </w:rPr>
+      </w:pPr>
+      <w:r>
+        <w:rPr>
+          <w:rFonts w:ascii="Times New Roman" w:hAnsi="Times New Roman" w:cs="Times New Roman"/>
+          <w:color w:val="0070C0"/>
+          <w:sz w:val="24"/>
+          <w:szCs w:val="24"/>
+        </w:rPr>
+        <w:t xml:space="preserve">For publication bias significance we just keep that in the text to avoid confusing </w:t>
+      </w:r>
+      <w:r>
+        <w:rPr>
+          <w:rFonts w:ascii="Times New Roman" w:hAnsi="Times New Roman" w:cs="Times New Roman"/>
+          <w:color w:val="0070C0"/>
+          <w:sz w:val="24"/>
+          <w:szCs w:val="24"/>
+        </w:rPr>
+        <w:t>readers but</w:t>
+      </w:r>
+      <w:r>
+        <w:rPr>
+          <w:rFonts w:ascii="Times New Roman" w:hAnsi="Times New Roman" w:cs="Times New Roman"/>
+          <w:color w:val="0070C0"/>
+          <w:sz w:val="24"/>
+          <w:szCs w:val="24"/>
+        </w:rPr>
+        <w:t xml:space="preserve"> make a note in the legend</w:t>
+      </w:r>
+      <w:r>
+        <w:rPr>
+          <w:rFonts w:ascii="Times New Roman" w:hAnsi="Times New Roman" w:cs="Times New Roman"/>
+          <w:color w:val="0070C0"/>
+          <w:sz w:val="24"/>
+          <w:szCs w:val="24"/>
+        </w:rPr>
+        <w:t xml:space="preserve"> of Figure 4</w:t>
+      </w:r>
+      <w:r>
+        <w:rPr>
+          <w:rFonts w:ascii="Times New Roman" w:hAnsi="Times New Roman" w:cs="Times New Roman"/>
+          <w:color w:val="0070C0"/>
+          <w:sz w:val="24"/>
+          <w:szCs w:val="24"/>
+        </w:rPr>
+        <w:t>.</w:t>
+      </w:r>
+    </w:p>
+    <w:p>
+      <w:pPr>
+        <w:spacing w:after="0"/>
+        <w:rPr>
+          <w:rFonts w:ascii="Times New Roman" w:hAnsi="Times New Roman" w:cs="Times New Roman"/>
+          <w:sz w:val="24"/>
+          <w:szCs w:val="24"/>
+        </w:rPr>
+      </w:pPr>
+      <w:r>
+        <w:rPr>
+          <w:rFonts w:ascii="Times New Roman" w:hAnsi="Times New Roman" w:cs="Times New Roman"/>
+          <w:sz w:val="24"/>
+          <w:szCs w:val="24"/>
+        </w:rPr>
+        <w:t xml:space="preserve">Have the authors considered organising the figures as the results section, i.e. per type of stressors rather than dividing by type of analysis (overall, taxonomic group, etc.)? Not sure if it would improve the manuscript but is worth giving a thought. I know there would be an imbalance since parental care deprivation was only done on mammals and postnatally, but it might make sense to show the data differently. </w:t>
+      </w:r>
+    </w:p>
+    <w:p>
+      <w:pPr>
+        <w:spacing w:after="0"/>
         <w:rPr>
           <w:rFonts w:ascii="Times New Roman" w:hAnsi="Times New Roman" w:cs="Times New Roman"/>
           <w:sz w:val="24"/>
           <w:szCs w:val="24"/>
           <w:highlight w:val="green"/>
         </w:rPr>
-        <w:t>might</w:t>
-      </w:r>
-      <w:proofErr w:type="gramEnd"/>
-      <w:r>
+      </w:pPr>
+      <w:r>
+        <w:rPr>
+          <w:rFonts w:ascii="Times New Roman" w:hAnsi="Times New Roman" w:cs="Times New Roman"/>
+          <w:color w:val="0070C0"/>
+          <w:sz w:val="24"/>
+          <w:szCs w:val="24"/>
+        </w:rPr>
+        <w:t>Thanks for suggesting this</w:t>
+      </w:r>
+      <w:r>
+        <w:rPr>
+          <w:rFonts w:ascii="Times New Roman" w:hAnsi="Times New Roman" w:cs="Times New Roman"/>
+          <w:color w:val="0070C0"/>
+          <w:sz w:val="24"/>
+          <w:szCs w:val="24"/>
+        </w:rPr>
+        <w:t xml:space="preserve">. It’s a fair point. We have tried re-organising the figures as suggested but it creates other challenges in reading the paper. </w:t>
+      </w:r>
+      <w:r>
+        <w:rPr>
+          <w:rFonts w:ascii="Times New Roman" w:hAnsi="Times New Roman" w:cs="Times New Roman"/>
+          <w:color w:val="0070C0"/>
+          <w:sz w:val="24"/>
+          <w:szCs w:val="24"/>
+        </w:rPr>
+        <w:t>As such, we have kept our current presentation.</w:t>
+      </w:r>
+    </w:p>
+    <w:p>
+      <w:pPr>
+        <w:spacing w:after="0"/>
         <w:rPr>
           <w:rFonts w:ascii="Times New Roman" w:hAnsi="Times New Roman" w:cs="Times New Roman"/>
           <w:sz w:val="24"/>
           <w:szCs w:val="24"/>
           <w:highlight w:val="green"/>
         </w:rPr>
-        <w:t xml:space="preserve"> due to the review system's formatting. I also don't understand where the raw data is </w:t>
-      </w:r>
-      <w:proofErr w:type="gramStart"/>
+      </w:pPr>
+      <w:commentRangeStart w:id="3"/>
+      <w:commentRangeStart w:id="4"/>
       <w:r>
         <w:rPr>
           <w:rFonts w:ascii="Times New Roman" w:hAnsi="Times New Roman" w:cs="Times New Roman"/>
@@ -3030,19 +3211,64 @@
           <w:szCs w:val="24"/>
           <w:highlight w:val="green"/>
         </w:rPr>
-        <w:t>shown?</w:t>
-      </w:r>
-      <w:proofErr w:type="gramEnd"/>
-      <w:r>
+        <w:t>Dan</w:t>
+      </w:r>
+      <w:commentRangeEnd w:id="3"/>
+      <w:r>
+        <w:rPr>
+          <w:rStyle w:val="CommentReference"/>
+        </w:rPr>
+        <w:commentReference w:id="3"/>
+      </w:r>
+      <w:commentRangeEnd w:id="4"/>
+      <w:r>
+        <w:rPr>
+          <w:rStyle w:val="CommentReference"/>
+        </w:rPr>
+        <w:commentReference w:id="4"/>
+      </w:r>
+    </w:p>
+    <w:p>
+      <w:pPr>
+        <w:spacing w:after="0"/>
+        <w:rPr>
+          <w:rFonts w:ascii="Times New Roman" w:hAnsi="Times New Roman" w:cs="Times New Roman"/>
+          <w:sz w:val="24"/>
+          <w:szCs w:val="24"/>
+          <w:highlight w:val="yellow"/>
+        </w:rPr>
+      </w:pPr>
+    </w:p>
+    <w:p>
+      <w:pPr>
+        <w:spacing w:after="0"/>
+        <w:rPr>
+          <w:rFonts w:ascii="Times New Roman" w:hAnsi="Times New Roman" w:cs="Times New Roman"/>
+          <w:sz w:val="24"/>
+          <w:szCs w:val="24"/>
+        </w:rPr>
+      </w:pPr>
+      <w:r>
+        <w:rPr>
+          <w:rFonts w:ascii="Times New Roman" w:hAnsi="Times New Roman" w:cs="Times New Roman"/>
+          <w:sz w:val="24"/>
+          <w:szCs w:val="24"/>
+        </w:rPr>
+        <w:t xml:space="preserve">Line 448: "and increased oxidative damage" ; from fig 5a it seems to me like it should be oxidative stress? </w:t>
+      </w:r>
+    </w:p>
+    <w:p>
+      <w:pPr>
+        <w:spacing w:after="0"/>
         <w:rPr>
           <w:rFonts w:ascii="Times New Roman" w:hAnsi="Times New Roman" w:cs="Times New Roman"/>
           <w:sz w:val="24"/>
           <w:szCs w:val="24"/>
           <w:highlight w:val="green"/>
         </w:rPr>
-        <w:t xml:space="preserve"> For both figs, is there a way to perhaps show significance (as reported in the text)? </w:t>
-      </w:r>
-      <w:proofErr w:type="gramStart"/>
+      </w:pPr>
+      <w:commentRangeStart w:id="5"/>
+      <w:commentRangeStart w:id="6"/>
       <w:r>
         <w:rPr>
           <w:rFonts w:ascii="Times New Roman" w:hAnsi="Times New Roman" w:cs="Times New Roman"/>
@@ -3050,45 +3276,95 @@
           <w:szCs w:val="24"/>
           <w:highlight w:val="green"/>
         </w:rPr>
-        <w:t>And also</w:t>
-      </w:r>
-      <w:proofErr w:type="gramEnd"/>
-      <w:r>
-        <w:rPr>
-          <w:rFonts w:ascii="Times New Roman" w:hAnsi="Times New Roman" w:cs="Times New Roman"/>
-          <w:sz w:val="24"/>
-          <w:szCs w:val="24"/>
-          <w:highlight w:val="green"/>
-        </w:rPr>
-        <w:t xml:space="preserve"> show publication bias significance where applicable (psychological disturbance)? </w:t>
-      </w:r>
-    </w:p>
-    <w:p>
-      <w:pPr>
-        <w:spacing w:after="0"/>
-        <w:rPr>
-          <w:rFonts w:ascii="Times New Roman" w:hAnsi="Times New Roman" w:cs="Times New Roman"/>
-          <w:sz w:val="24"/>
-          <w:szCs w:val="24"/>
-          <w:highlight w:val="green"/>
-        </w:rPr>
-      </w:pPr>
-      <w:commentRangeStart w:id="1"/>
-      <w:r>
-        <w:rPr>
-          <w:rFonts w:ascii="Times New Roman" w:hAnsi="Times New Roman" w:cs="Times New Roman"/>
-          <w:sz w:val="24"/>
-          <w:szCs w:val="24"/>
-          <w:highlight w:val="green"/>
-        </w:rPr>
         <w:t>Dan</w:t>
       </w:r>
-      <w:commentRangeEnd w:id="1"/>
+      <w:commentRangeEnd w:id="5"/>
       <w:r>
         <w:rPr>
           <w:rStyle w:val="CommentReference"/>
         </w:rPr>
-        <w:commentReference w:id="1"/>
+        <w:commentReference w:id="5"/>
+      </w:r>
+      <w:commentRangeEnd w:id="6"/>
+      <w:r>
+        <w:rPr>
+          <w:rStyle w:val="CommentReference"/>
+        </w:rPr>
+        <w:commentReference w:id="6"/>
+      </w:r>
+    </w:p>
+    <w:p>
+      <w:pPr>
+        <w:spacing w:after="0"/>
+        <w:rPr>
+          <w:rFonts w:ascii="Times New Roman" w:hAnsi="Times New Roman" w:cs="Times New Roman"/>
+          <w:color w:val="0070C0"/>
+          <w:sz w:val="24"/>
+          <w:szCs w:val="24"/>
+        </w:rPr>
+      </w:pPr>
+      <w:r>
+        <w:rPr>
+          <w:rFonts w:ascii="Times New Roman" w:hAnsi="Times New Roman" w:cs="Times New Roman"/>
+          <w:color w:val="0070C0"/>
+          <w:sz w:val="24"/>
+          <w:szCs w:val="24"/>
+        </w:rPr>
+        <w:t xml:space="preserve">Thanks for </w:t>
+      </w:r>
+      <w:r>
+        <w:rPr>
+          <w:rFonts w:ascii="Times New Roman" w:hAnsi="Times New Roman" w:cs="Times New Roman"/>
+          <w:color w:val="0070C0"/>
+          <w:sz w:val="24"/>
+          <w:szCs w:val="24"/>
+        </w:rPr>
+        <w:t>catching this mistake. It’s both damage and stress</w:t>
+      </w:r>
+      <w:r>
+        <w:rPr>
+          <w:rFonts w:ascii="Times New Roman" w:hAnsi="Times New Roman" w:cs="Times New Roman"/>
+          <w:color w:val="0070C0"/>
+          <w:sz w:val="24"/>
+          <w:szCs w:val="24"/>
+        </w:rPr>
+        <w:t xml:space="preserve"> we meant to refer to</w:t>
+      </w:r>
+      <w:r>
+        <w:rPr>
+          <w:rFonts w:ascii="Times New Roman" w:hAnsi="Times New Roman" w:cs="Times New Roman"/>
+          <w:color w:val="0070C0"/>
+          <w:sz w:val="24"/>
+          <w:szCs w:val="24"/>
+        </w:rPr>
+        <w:t xml:space="preserve">, but we missed </w:t>
+      </w:r>
+      <w:r>
+        <w:rPr>
+          <w:rFonts w:ascii="Times New Roman" w:hAnsi="Times New Roman" w:cs="Times New Roman"/>
+          <w:color w:val="0070C0"/>
+          <w:sz w:val="24"/>
+          <w:szCs w:val="24"/>
+        </w:rPr>
+        <w:t>oxidative stress</w:t>
+      </w:r>
+      <w:r>
+        <w:rPr>
+          <w:rFonts w:ascii="Times New Roman" w:hAnsi="Times New Roman" w:cs="Times New Roman"/>
+          <w:color w:val="0070C0"/>
+          <w:sz w:val="24"/>
+          <w:szCs w:val="24"/>
+        </w:rPr>
+        <w:t>. We’ve now added the corrected text</w:t>
+      </w:r>
+      <w:r>
+        <w:rPr>
+          <w:rFonts w:ascii="Times New Roman" w:hAnsi="Times New Roman" w:cs="Times New Roman"/>
+          <w:color w:val="0070C0"/>
+          <w:sz w:val="24"/>
+          <w:szCs w:val="24"/>
+        </w:rPr>
+        <w:t xml:space="preserve"> and result.</w:t>
       </w:r>
     </w:p>
     <w:p>
@@ -3109,175 +3385,461 @@
           <w:rFonts w:ascii="Times New Roman" w:hAnsi="Times New Roman" w:cs="Times New Roman"/>
           <w:sz w:val="24"/>
           <w:szCs w:val="24"/>
-          <w:highlight w:val="green"/>
-        </w:rPr>
-      </w:pPr>
-      <w:r>
-        <w:rPr>
-          <w:rFonts w:ascii="Times New Roman" w:hAnsi="Times New Roman" w:cs="Times New Roman"/>
-          <w:sz w:val="24"/>
-          <w:szCs w:val="24"/>
-          <w:highlight w:val="green"/>
+        </w:rPr>
+      </w:pPr>
+      <w:r>
+        <w:rPr>
+          <w:rFonts w:ascii="Times New Roman" w:hAnsi="Times New Roman" w:cs="Times New Roman"/>
+          <w:sz w:val="24"/>
+          <w:szCs w:val="24"/>
+        </w:rPr>
+        <w:t>For fig 5 specifically, would it be possible to rank the functional trait categories from most to least impacted (top to bottom)? The reader could therefore see at a glance which category is most affected by each developmental stressor.</w:t>
+      </w:r>
+      <w:r>
+        <w:rPr>
+          <w:rFonts w:ascii="Times New Roman" w:hAnsi="Times New Roman" w:cs="Times New Roman"/>
+          <w:sz w:val="24"/>
+          <w:szCs w:val="24"/>
+        </w:rPr>
+        <w:t xml:space="preserve"> </w:t>
+      </w:r>
+    </w:p>
+    <w:p>
+      <w:pPr>
+        <w:spacing w:after="0"/>
+        <w:rPr>
+          <w:rFonts w:ascii="Times New Roman" w:hAnsi="Times New Roman" w:cs="Times New Roman"/>
+          <w:sz w:val="24"/>
+          <w:szCs w:val="24"/>
+        </w:rPr>
+      </w:pPr>
+      <w:r>
+        <w:rPr>
+          <w:rFonts w:ascii="Times New Roman" w:hAnsi="Times New Roman" w:cs="Times New Roman"/>
+          <w:color w:val="0070C0"/>
+          <w:sz w:val="24"/>
+          <w:szCs w:val="24"/>
+        </w:rPr>
+        <w:t>Good suggestion, but in dealing with an earlier suggestion</w:t>
+      </w:r>
+      <w:r>
+        <w:rPr>
+          <w:rFonts w:ascii="Times New Roman" w:hAnsi="Times New Roman" w:cs="Times New Roman"/>
+          <w:color w:val="0070C0"/>
+          <w:sz w:val="24"/>
+          <w:szCs w:val="24"/>
+        </w:rPr>
+        <w:t>,</w:t>
+      </w:r>
+      <w:r>
+        <w:rPr>
+          <w:rFonts w:ascii="Times New Roman" w:hAnsi="Times New Roman" w:cs="Times New Roman"/>
+          <w:color w:val="0070C0"/>
+          <w:sz w:val="24"/>
+          <w:szCs w:val="24"/>
+        </w:rPr>
+        <w:t xml:space="preserve"> we have instead added the p-values so readers can better gauge significance instead</w:t>
+      </w:r>
+      <w:r>
+        <w:rPr>
+          <w:rFonts w:ascii="Times New Roman" w:hAnsi="Times New Roman" w:cs="Times New Roman"/>
+          <w:color w:val="0070C0"/>
+          <w:sz w:val="24"/>
+          <w:szCs w:val="24"/>
+        </w:rPr>
+        <w:t>. We don’t think the order is necessary now.</w:t>
+      </w:r>
+    </w:p>
+    <w:p>
+      <w:pPr>
+        <w:spacing w:after="0"/>
+        <w:rPr>
+          <w:rFonts w:ascii="Times New Roman" w:hAnsi="Times New Roman" w:cs="Times New Roman"/>
+          <w:sz w:val="24"/>
+          <w:szCs w:val="24"/>
+        </w:rPr>
+      </w:pPr>
+    </w:p>
+    <w:p>
+      <w:pPr>
+        <w:spacing w:after="0"/>
+        <w:rPr>
+          <w:rFonts w:ascii="Times New Roman" w:hAnsi="Times New Roman" w:cs="Times New Roman"/>
+          <w:sz w:val="24"/>
+          <w:szCs w:val="24"/>
+        </w:rPr>
+      </w:pPr>
+      <w:r>
+        <w:rPr>
+          <w:rFonts w:ascii="Times New Roman" w:hAnsi="Times New Roman" w:cs="Times New Roman"/>
+          <w:sz w:val="24"/>
+          <w:szCs w:val="24"/>
+        </w:rPr>
+        <w:t>Line 519: should be fig 5D, not 3D I believe.</w:t>
+      </w:r>
+    </w:p>
+    <w:p>
+      <w:pPr>
+        <w:spacing w:after="0"/>
+        <w:rPr>
+          <w:rFonts w:ascii="Times New Roman" w:hAnsi="Times New Roman" w:cs="Times New Roman"/>
+          <w:color w:val="0070C0"/>
+          <w:sz w:val="24"/>
+          <w:szCs w:val="24"/>
+        </w:rPr>
+      </w:pPr>
+      <w:r>
+        <w:rPr>
+          <w:rFonts w:ascii="Times New Roman" w:hAnsi="Times New Roman" w:cs="Times New Roman"/>
+          <w:color w:val="0070C0"/>
+          <w:sz w:val="24"/>
+          <w:szCs w:val="24"/>
+        </w:rPr>
+        <w:t>We have corrected this line, and it now reads: “</w:t>
+      </w:r>
+      <w:r>
+        <w:rPr>
+          <w:rFonts w:ascii="Times New Roman" w:hAnsi="Times New Roman" w:cs="Times New Roman"/>
+          <w:i/>
+          <w:iCs/>
+          <w:color w:val="0070C0"/>
+          <w:sz w:val="24"/>
+          <w:szCs w:val="24"/>
+          <w:lang w:val="en-US"/>
+        </w:rPr>
+        <w:t xml:space="preserve">However, there was little evidence that mitochondrial respiratory function differed across functional trait categories generally (Fig. 5D).” </w:t>
+      </w:r>
+      <w:r>
+        <w:rPr>
+          <w:rFonts w:ascii="Times New Roman" w:hAnsi="Times New Roman" w:cs="Times New Roman"/>
+          <w:i/>
+          <w:iCs/>
+          <w:color w:val="0070C0"/>
+          <w:sz w:val="24"/>
+          <w:szCs w:val="24"/>
+        </w:rPr>
+        <w:t xml:space="preserve"> </w:t>
+      </w:r>
+    </w:p>
+    <w:p>
+      <w:pPr>
+        <w:spacing w:after="0"/>
+        <w:rPr>
+          <w:rFonts w:ascii="Times New Roman" w:hAnsi="Times New Roman" w:cs="Times New Roman"/>
+          <w:sz w:val="24"/>
+          <w:szCs w:val="24"/>
+        </w:rPr>
+      </w:pPr>
+    </w:p>
+    <w:p>
+      <w:pPr>
+        <w:spacing w:after="0"/>
+        <w:rPr>
+          <w:rFonts w:ascii="Times New Roman" w:hAnsi="Times New Roman" w:cs="Times New Roman"/>
+          <w:sz w:val="24"/>
+          <w:szCs w:val="24"/>
+        </w:rPr>
+      </w:pPr>
+      <w:r>
+        <w:rPr>
+          <w:rFonts w:ascii="Times New Roman" w:hAnsi="Times New Roman" w:cs="Times New Roman"/>
+          <w:sz w:val="24"/>
+          <w:szCs w:val="24"/>
+        </w:rPr>
+        <w:t>Line 535: should be fig 7C not 7D?</w:t>
+      </w:r>
+      <w:r>
+        <w:rPr>
+          <w:rFonts w:ascii="Times New Roman" w:hAnsi="Times New Roman" w:cs="Times New Roman"/>
+          <w:sz w:val="24"/>
+          <w:szCs w:val="24"/>
+        </w:rPr>
+        <w:t xml:space="preserve"> </w:t>
+      </w:r>
+    </w:p>
+    <w:p>
+      <w:pPr>
+        <w:spacing w:after="0"/>
+        <w:rPr>
+          <w:rFonts w:ascii="Times New Roman" w:hAnsi="Times New Roman" w:cs="Times New Roman"/>
+          <w:color w:val="0070C0"/>
+          <w:sz w:val="24"/>
+          <w:szCs w:val="24"/>
+        </w:rPr>
+      </w:pPr>
+      <w:r>
+        <w:rPr>
+          <w:rFonts w:ascii="Times New Roman" w:hAnsi="Times New Roman" w:cs="Times New Roman"/>
+          <w:color w:val="0070C0"/>
+          <w:sz w:val="24"/>
+          <w:szCs w:val="24"/>
+        </w:rPr>
+        <w:t>We have changed the original Line 525 to: “</w:t>
+      </w:r>
+      <w:r>
+        <w:rPr>
+          <w:rFonts w:ascii="Times New Roman" w:hAnsi="Times New Roman" w:cs="Times New Roman"/>
+          <w:i/>
+          <w:iCs/>
+          <w:color w:val="0070C0"/>
+          <w:sz w:val="24"/>
+          <w:szCs w:val="24"/>
+          <w:lang w:val="en-US"/>
+        </w:rPr>
+        <w:t>There was no evidence that mitochondrial respiratory function was impacted by the developmental stage when nutritional manipulations were applied (Fig. 7C).</w:t>
+      </w:r>
+      <w:r>
+        <w:rPr>
+          <w:rFonts w:ascii="Times New Roman" w:hAnsi="Times New Roman" w:cs="Times New Roman"/>
+          <w:color w:val="0070C0"/>
+          <w:sz w:val="24"/>
+          <w:szCs w:val="24"/>
+          <w:lang w:val="en-US"/>
+        </w:rPr>
+        <w:t>”</w:t>
+      </w:r>
+    </w:p>
+    <w:p>
+      <w:pPr>
+        <w:spacing w:after="0"/>
+        <w:rPr>
+          <w:rFonts w:ascii="Times New Roman" w:hAnsi="Times New Roman" w:cs="Times New Roman"/>
+          <w:sz w:val="24"/>
+          <w:szCs w:val="24"/>
+        </w:rPr>
+      </w:pPr>
+    </w:p>
+    <w:p>
+      <w:pPr>
+        <w:spacing w:after="0"/>
+        <w:rPr>
+          <w:rFonts w:ascii="Times New Roman" w:hAnsi="Times New Roman" w:cs="Times New Roman"/>
+          <w:sz w:val="24"/>
+          <w:szCs w:val="24"/>
+        </w:rPr>
+      </w:pPr>
+      <w:r>
+        <w:rPr>
+          <w:rFonts w:ascii="Times New Roman" w:hAnsi="Times New Roman" w:cs="Times New Roman"/>
+          <w:sz w:val="24"/>
+          <w:szCs w:val="24"/>
+        </w:rPr>
+        <w:t>Figure 8 would be clearer if "nutritional stressors" was written at the top of the figure as in the other ones.</w:t>
+      </w:r>
+      <w:r>
+        <w:rPr>
+          <w:rFonts w:ascii="Times New Roman" w:hAnsi="Times New Roman" w:cs="Times New Roman"/>
+          <w:sz w:val="24"/>
+          <w:szCs w:val="24"/>
+        </w:rPr>
+        <w:t xml:space="preserve"> </w:t>
+      </w:r>
+    </w:p>
+    <w:p>
+      <w:pPr>
+        <w:spacing w:after="0"/>
+        <w:rPr>
+          <w:rFonts w:ascii="Times New Roman" w:hAnsi="Times New Roman" w:cs="Times New Roman"/>
+          <w:sz w:val="24"/>
+          <w:szCs w:val="24"/>
+        </w:rPr>
+      </w:pPr>
+      <w:r>
+        <w:rPr>
+          <w:rFonts w:ascii="Times New Roman" w:hAnsi="Times New Roman" w:cs="Times New Roman"/>
+          <w:color w:val="0070C0"/>
+          <w:sz w:val="24"/>
+          <w:szCs w:val="24"/>
         </w:rPr>
         <w:lastRenderedPageBreak/>
-        <w:t xml:space="preserve">Have the authors considered organising the figures as the results section, i.e. per type of stressors rather than dividing by type of analysis (overall, taxonomic group, etc.)? Not sure if it would improve the manuscript but is worth giving a thought. I know there would be an imbalance since parental care deprivation was only done on mammals and postnatally, but it might make sense to show the data differently. </w:t>
-      </w:r>
-    </w:p>
-    <w:p>
-      <w:pPr>
-        <w:spacing w:after="0"/>
-        <w:rPr>
-          <w:rFonts w:ascii="Times New Roman" w:hAnsi="Times New Roman" w:cs="Times New Roman"/>
-          <w:sz w:val="24"/>
-          <w:szCs w:val="24"/>
-          <w:highlight w:val="green"/>
-        </w:rPr>
-      </w:pPr>
-      <w:commentRangeStart w:id="2"/>
-      <w:r>
-        <w:rPr>
-          <w:rFonts w:ascii="Times New Roman" w:hAnsi="Times New Roman" w:cs="Times New Roman"/>
-          <w:sz w:val="24"/>
-          <w:szCs w:val="24"/>
-          <w:highlight w:val="green"/>
-        </w:rPr>
-        <w:t>Dan</w:t>
-      </w:r>
-      <w:commentRangeEnd w:id="2"/>
+        <w:t>Good suggestion. We have now added the title to the figure.</w:t>
+      </w:r>
+      <w:r>
+        <w:rPr>
+          <w:rFonts w:ascii="Times New Roman" w:hAnsi="Times New Roman" w:cs="Times New Roman"/>
+          <w:color w:val="0070C0"/>
+          <w:sz w:val="24"/>
+          <w:szCs w:val="24"/>
+        </w:rPr>
+        <w:t xml:space="preserve"> Renaming to nutritional imbalance to be consistent with the rest of the figures.</w:t>
+      </w:r>
+    </w:p>
+    <w:p>
+      <w:pPr>
+        <w:spacing w:after="0"/>
+        <w:rPr>
+          <w:rFonts w:ascii="Times New Roman" w:hAnsi="Times New Roman" w:cs="Times New Roman"/>
+          <w:sz w:val="24"/>
+          <w:szCs w:val="24"/>
+        </w:rPr>
+      </w:pPr>
+    </w:p>
+    <w:p>
+      <w:pPr>
+        <w:spacing w:after="0"/>
+        <w:rPr>
+          <w:rFonts w:ascii="Times New Roman" w:hAnsi="Times New Roman" w:cs="Times New Roman"/>
+          <w:sz w:val="24"/>
+          <w:szCs w:val="24"/>
+        </w:rPr>
+      </w:pPr>
+      <w:r>
+        <w:rPr>
+          <w:rFonts w:ascii="Times New Roman" w:hAnsi="Times New Roman" w:cs="Times New Roman"/>
+          <w:sz w:val="24"/>
+          <w:szCs w:val="24"/>
+        </w:rPr>
+        <w:t xml:space="preserve">Discussion sentence starting line 573 is missing a comma or a period. </w:t>
+      </w:r>
+    </w:p>
+    <w:p>
+      <w:pPr>
+        <w:spacing w:after="0"/>
+        <w:rPr>
+          <w:rFonts w:ascii="Times New Roman" w:hAnsi="Times New Roman" w:cs="Times New Roman"/>
+          <w:color w:val="0070C0"/>
+          <w:sz w:val="24"/>
+          <w:szCs w:val="24"/>
+        </w:rPr>
+      </w:pPr>
+      <w:r>
+        <w:rPr>
+          <w:rFonts w:ascii="Times New Roman" w:hAnsi="Times New Roman" w:cs="Times New Roman"/>
+          <w:color w:val="0070C0"/>
+          <w:sz w:val="24"/>
+          <w:szCs w:val="24"/>
+        </w:rPr>
+        <w:t xml:space="preserve">Thanks for catching this. We’ve removed the second “glucocorticoids” from the sentence which means it no longer requires a comma. </w:t>
+      </w:r>
+      <w:r>
+        <w:rPr>
+          <w:rFonts w:ascii="Times New Roman" w:hAnsi="Times New Roman" w:cs="Times New Roman"/>
+          <w:color w:val="0070C0"/>
+          <w:sz w:val="24"/>
+          <w:szCs w:val="24"/>
+        </w:rPr>
+        <w:t xml:space="preserve">The sentence is now written: </w:t>
+      </w:r>
+      <w:r>
+        <w:rPr>
+          <w:rFonts w:ascii="Times New Roman" w:hAnsi="Times New Roman" w:cs="Times New Roman"/>
+          <w:color w:val="0070C0"/>
+          <w:sz w:val="24"/>
+          <w:szCs w:val="24"/>
+        </w:rPr>
+        <w:t>“</w:t>
+      </w:r>
+      <w:r>
+        <w:rPr>
+          <w:rFonts w:ascii="Times New Roman" w:hAnsi="Times New Roman" w:cs="Times New Roman"/>
+          <w:i/>
+          <w:iCs/>
+          <w:color w:val="0070C0"/>
+          <w:sz w:val="24"/>
+          <w:szCs w:val="24"/>
+          <w:lang w:val="en-US"/>
+        </w:rPr>
+        <w:t>Glucocorticoids and mitochondria are intrinsically linked because glucocorticoids are synthesized by mitochondria and modulate the availability of energy organisms need to cope with stressors through genomic and non-genomic effects on mitochondrial respiratory function.”</w:t>
+      </w:r>
+    </w:p>
+    <w:p>
+      <w:pPr>
+        <w:spacing w:after="0"/>
+        <w:rPr>
+          <w:rFonts w:ascii="Times New Roman" w:hAnsi="Times New Roman" w:cs="Times New Roman"/>
+          <w:sz w:val="24"/>
+          <w:szCs w:val="24"/>
+        </w:rPr>
+      </w:pPr>
+    </w:p>
+    <w:p>
+      <w:pPr>
+        <w:spacing w:after="0"/>
+        <w:rPr>
+          <w:rFonts w:ascii="Times New Roman" w:hAnsi="Times New Roman" w:cs="Times New Roman"/>
+          <w:sz w:val="24"/>
+          <w:szCs w:val="24"/>
+        </w:rPr>
+      </w:pPr>
+      <w:r>
+        <w:rPr>
+          <w:rFonts w:ascii="Times New Roman" w:hAnsi="Times New Roman" w:cs="Times New Roman"/>
+          <w:sz w:val="24"/>
+          <w:szCs w:val="24"/>
+        </w:rPr>
+        <w:t>SI: might be good to explain what the heterogeneity "CV" and "M2" parameters are.</w:t>
+      </w:r>
+      <w:r>
+        <w:rPr>
+          <w:rFonts w:ascii="Times New Roman" w:hAnsi="Times New Roman" w:cs="Times New Roman"/>
+          <w:sz w:val="24"/>
+          <w:szCs w:val="24"/>
+        </w:rPr>
+        <w:t xml:space="preserve"> </w:t>
+      </w:r>
+    </w:p>
+    <w:p>
+      <w:pPr>
+        <w:spacing w:after="0"/>
+        <w:rPr>
+          <w:rFonts w:ascii="Times New Roman" w:hAnsi="Times New Roman" w:cs="Times New Roman"/>
+          <w:sz w:val="24"/>
+          <w:szCs w:val="24"/>
+        </w:rPr>
+      </w:pPr>
+      <w:commentRangeStart w:id="7"/>
+      <w:commentRangeStart w:id="8"/>
+      <w:r>
+        <w:rPr>
+          <w:rFonts w:ascii="Times New Roman" w:hAnsi="Times New Roman" w:cs="Times New Roman"/>
+          <w:color w:val="0070C0"/>
+          <w:sz w:val="24"/>
+          <w:szCs w:val="24"/>
+        </w:rPr>
+        <w:t xml:space="preserve">We now define “CV” and “M2” in the table legends in the Supplemental Materials. </w:t>
+      </w:r>
+      <w:commentRangeEnd w:id="7"/>
       <w:r>
         <w:rPr>
           <w:rStyle w:val="CommentReference"/>
-        </w:rPr>
-        <w:commentReference w:id="2"/>
-      </w:r>
-    </w:p>
-    <w:p>
-      <w:pPr>
-        <w:spacing w:after="0"/>
-        <w:rPr>
-          <w:rFonts w:ascii="Times New Roman" w:hAnsi="Times New Roman" w:cs="Times New Roman"/>
-          <w:sz w:val="24"/>
-          <w:szCs w:val="24"/>
-          <w:highlight w:val="yellow"/>
-        </w:rPr>
-      </w:pPr>
-    </w:p>
-    <w:p>
-      <w:pPr>
-        <w:spacing w:after="0"/>
-        <w:rPr>
-          <w:rFonts w:ascii="Times New Roman" w:hAnsi="Times New Roman" w:cs="Times New Roman"/>
-          <w:sz w:val="24"/>
-          <w:szCs w:val="24"/>
-          <w:highlight w:val="green"/>
-        </w:rPr>
-      </w:pPr>
-      <w:r>
-        <w:rPr>
-          <w:rFonts w:ascii="Times New Roman" w:hAnsi="Times New Roman" w:cs="Times New Roman"/>
-          <w:sz w:val="24"/>
-          <w:szCs w:val="24"/>
-          <w:highlight w:val="green"/>
-        </w:rPr>
-        <w:t>Line 448: "and increased oxidative damage</w:t>
-      </w:r>
-      <w:proofErr w:type="gramStart"/>
-      <w:r>
-        <w:rPr>
-          <w:rFonts w:ascii="Times New Roman" w:hAnsi="Times New Roman" w:cs="Times New Roman"/>
-          <w:sz w:val="24"/>
-          <w:szCs w:val="24"/>
-          <w:highlight w:val="green"/>
-        </w:rPr>
-        <w:t>" ;</w:t>
-      </w:r>
-      <w:proofErr w:type="gramEnd"/>
-      <w:r>
-        <w:rPr>
-          <w:rFonts w:ascii="Times New Roman" w:hAnsi="Times New Roman" w:cs="Times New Roman"/>
-          <w:sz w:val="24"/>
-          <w:szCs w:val="24"/>
-          <w:highlight w:val="green"/>
-        </w:rPr>
-        <w:t xml:space="preserve"> from fig 5a it seems to me like it should be oxidative stress? </w:t>
-      </w:r>
-    </w:p>
-    <w:p>
-      <w:pPr>
-        <w:spacing w:after="0"/>
-        <w:rPr>
-          <w:rFonts w:ascii="Times New Roman" w:hAnsi="Times New Roman" w:cs="Times New Roman"/>
-          <w:sz w:val="24"/>
-          <w:szCs w:val="24"/>
-          <w:highlight w:val="green"/>
-        </w:rPr>
-      </w:pPr>
-      <w:commentRangeStart w:id="3"/>
-      <w:r>
-        <w:rPr>
-          <w:rFonts w:ascii="Times New Roman" w:hAnsi="Times New Roman" w:cs="Times New Roman"/>
-          <w:sz w:val="24"/>
-          <w:szCs w:val="24"/>
-          <w:highlight w:val="green"/>
-        </w:rPr>
-        <w:t>Dan</w:t>
-      </w:r>
-      <w:commentRangeEnd w:id="3"/>
+          <w:color w:val="0070C0"/>
+        </w:rPr>
+        <w:commentReference w:id="7"/>
+      </w:r>
+      <w:commentRangeEnd w:id="8"/>
       <w:r>
         <w:rPr>
           <w:rStyle w:val="CommentReference"/>
         </w:rPr>
-        <w:commentReference w:id="3"/>
-      </w:r>
-    </w:p>
-    <w:p>
-      <w:pPr>
-        <w:spacing w:after="0"/>
-        <w:rPr>
-          <w:rFonts w:ascii="Times New Roman" w:hAnsi="Times New Roman" w:cs="Times New Roman"/>
-          <w:sz w:val="24"/>
-          <w:szCs w:val="24"/>
-          <w:highlight w:val="yellow"/>
-        </w:rPr>
-      </w:pPr>
-    </w:p>
-    <w:p>
-      <w:pPr>
-        <w:spacing w:after="0"/>
-        <w:rPr>
-          <w:rFonts w:ascii="Times New Roman" w:hAnsi="Times New Roman" w:cs="Times New Roman"/>
-          <w:sz w:val="24"/>
-          <w:szCs w:val="24"/>
-        </w:rPr>
-      </w:pPr>
-      <w:r>
-        <w:rPr>
-          <w:rFonts w:ascii="Times New Roman" w:hAnsi="Times New Roman" w:cs="Times New Roman"/>
-          <w:sz w:val="24"/>
-          <w:szCs w:val="24"/>
-          <w:highlight w:val="green"/>
-        </w:rPr>
-        <w:t xml:space="preserve">For fig 5 specifically, would it be possible to rank the functional trait categories from most to least impacted (top to bottom)? The reader could therefore see </w:t>
-      </w:r>
-      <w:proofErr w:type="gramStart"/>
-      <w:r>
-        <w:rPr>
-          <w:rFonts w:ascii="Times New Roman" w:hAnsi="Times New Roman" w:cs="Times New Roman"/>
-          <w:sz w:val="24"/>
-          <w:szCs w:val="24"/>
-          <w:highlight w:val="green"/>
-        </w:rPr>
-        <w:t>at a glance</w:t>
-      </w:r>
-      <w:proofErr w:type="gramEnd"/>
-      <w:r>
-        <w:rPr>
-          <w:rFonts w:ascii="Times New Roman" w:hAnsi="Times New Roman" w:cs="Times New Roman"/>
-          <w:sz w:val="24"/>
-          <w:szCs w:val="24"/>
-          <w:highlight w:val="green"/>
-        </w:rPr>
-        <w:t xml:space="preserve"> which category is most affected by each developmental stressor.</w:t>
+        <w:commentReference w:id="8"/>
+      </w:r>
+    </w:p>
+    <w:p>
+      <w:pPr>
+        <w:spacing w:after="0"/>
+        <w:rPr>
+          <w:rFonts w:ascii="Times New Roman" w:hAnsi="Times New Roman" w:cs="Times New Roman"/>
+          <w:sz w:val="24"/>
+          <w:szCs w:val="24"/>
+        </w:rPr>
+      </w:pPr>
+    </w:p>
+    <w:p>
+      <w:pPr>
+        <w:spacing w:after="0"/>
+        <w:rPr>
+          <w:rFonts w:ascii="Times New Roman" w:hAnsi="Times New Roman" w:cs="Times New Roman"/>
+          <w:sz w:val="24"/>
+          <w:szCs w:val="24"/>
+        </w:rPr>
+      </w:pPr>
+      <w:r>
+        <w:rPr>
+          <w:rFonts w:ascii="Times New Roman" w:hAnsi="Times New Roman" w:cs="Times New Roman"/>
+          <w:sz w:val="24"/>
+          <w:szCs w:val="24"/>
+        </w:rPr>
+        <w:t>SI lines 43-44: check the reference to the figures, as it seems wrong (not figure 8 and should be SI figure 1D).</w:t>
       </w:r>
       <w:r>
         <w:rPr>
@@ -3293,423 +3855,6 @@
         <w:spacing w:after="0"/>
         <w:rPr>
           <w:rFonts w:ascii="Times New Roman" w:hAnsi="Times New Roman" w:cs="Times New Roman"/>
-          <w:sz w:val="24"/>
-          <w:szCs w:val="24"/>
-        </w:rPr>
-      </w:pPr>
-      <w:commentRangeStart w:id="4"/>
-      <w:r>
-        <w:rPr>
-          <w:rFonts w:ascii="Times New Roman" w:hAnsi="Times New Roman" w:cs="Times New Roman"/>
-          <w:sz w:val="24"/>
-          <w:szCs w:val="24"/>
-        </w:rPr>
-        <w:t>Dan</w:t>
-      </w:r>
-      <w:commentRangeEnd w:id="4"/>
-      <w:r>
-        <w:rPr>
-          <w:rStyle w:val="CommentReference"/>
-        </w:rPr>
-        <w:commentReference w:id="4"/>
-      </w:r>
-    </w:p>
-    <w:p>
-      <w:pPr>
-        <w:spacing w:after="0"/>
-        <w:rPr>
-          <w:rFonts w:ascii="Times New Roman" w:hAnsi="Times New Roman" w:cs="Times New Roman"/>
-          <w:sz w:val="24"/>
-          <w:szCs w:val="24"/>
-        </w:rPr>
-      </w:pPr>
-    </w:p>
-    <w:p>
-      <w:pPr>
-        <w:spacing w:after="0"/>
-        <w:rPr>
-          <w:rFonts w:ascii="Times New Roman" w:hAnsi="Times New Roman" w:cs="Times New Roman"/>
-          <w:sz w:val="24"/>
-          <w:szCs w:val="24"/>
-        </w:rPr>
-      </w:pPr>
-      <w:r>
-        <w:rPr>
-          <w:rFonts w:ascii="Times New Roman" w:hAnsi="Times New Roman" w:cs="Times New Roman"/>
-          <w:sz w:val="24"/>
-          <w:szCs w:val="24"/>
-        </w:rPr>
-        <w:t>Line 519: should be fig 5D, not 3D I believe.</w:t>
-      </w:r>
-    </w:p>
-    <w:p>
-      <w:pPr>
-        <w:spacing w:after="0"/>
-        <w:rPr>
-          <w:rFonts w:ascii="Times New Roman" w:hAnsi="Times New Roman" w:cs="Times New Roman"/>
-          <w:color w:val="0070C0"/>
-          <w:sz w:val="24"/>
-          <w:szCs w:val="24"/>
-        </w:rPr>
-      </w:pPr>
-      <w:r>
-        <w:rPr>
-          <w:rFonts w:ascii="Times New Roman" w:hAnsi="Times New Roman" w:cs="Times New Roman"/>
-          <w:color w:val="0070C0"/>
-          <w:sz w:val="24"/>
-          <w:szCs w:val="24"/>
-        </w:rPr>
-        <w:t>We have corrected this line, and it now reads: “</w:t>
-      </w:r>
-      <w:r>
-        <w:rPr>
-          <w:rFonts w:ascii="Times New Roman" w:hAnsi="Times New Roman" w:cs="Times New Roman"/>
-          <w:i/>
-          <w:iCs/>
-          <w:color w:val="0070C0"/>
-          <w:sz w:val="24"/>
-          <w:szCs w:val="24"/>
-          <w:lang w:val="en-US"/>
-        </w:rPr>
-        <w:t xml:space="preserve">However, there was little evidence that mitochondrial respiratory function differed across functional trait categories generally (Fig. 5D).” </w:t>
-      </w:r>
-      <w:r>
-        <w:rPr>
-          <w:rFonts w:ascii="Times New Roman" w:hAnsi="Times New Roman" w:cs="Times New Roman"/>
-          <w:i/>
-          <w:iCs/>
-          <w:color w:val="0070C0"/>
-          <w:sz w:val="24"/>
-          <w:szCs w:val="24"/>
-        </w:rPr>
-        <w:t xml:space="preserve"> </w:t>
-      </w:r>
-    </w:p>
-    <w:p>
-      <w:pPr>
-        <w:spacing w:after="0"/>
-        <w:rPr>
-          <w:rFonts w:ascii="Times New Roman" w:hAnsi="Times New Roman" w:cs="Times New Roman"/>
-          <w:sz w:val="24"/>
-          <w:szCs w:val="24"/>
-        </w:rPr>
-      </w:pPr>
-    </w:p>
-    <w:p>
-      <w:pPr>
-        <w:spacing w:after="0"/>
-        <w:rPr>
-          <w:rFonts w:ascii="Times New Roman" w:hAnsi="Times New Roman" w:cs="Times New Roman"/>
-          <w:sz w:val="24"/>
-          <w:szCs w:val="24"/>
-        </w:rPr>
-      </w:pPr>
-      <w:r>
-        <w:rPr>
-          <w:rFonts w:ascii="Times New Roman" w:hAnsi="Times New Roman" w:cs="Times New Roman"/>
-          <w:sz w:val="24"/>
-          <w:szCs w:val="24"/>
-        </w:rPr>
-        <w:t>Line 535: should be fig 7C not 7D?</w:t>
-      </w:r>
-      <w:r>
-        <w:rPr>
-          <w:rFonts w:ascii="Times New Roman" w:hAnsi="Times New Roman" w:cs="Times New Roman"/>
-          <w:sz w:val="24"/>
-          <w:szCs w:val="24"/>
-        </w:rPr>
-        <w:t xml:space="preserve"> </w:t>
-      </w:r>
-    </w:p>
-    <w:p>
-      <w:pPr>
-        <w:spacing w:after="0"/>
-        <w:rPr>
-          <w:rFonts w:ascii="Times New Roman" w:hAnsi="Times New Roman" w:cs="Times New Roman"/>
-          <w:color w:val="0070C0"/>
-          <w:sz w:val="24"/>
-          <w:szCs w:val="24"/>
-        </w:rPr>
-      </w:pPr>
-      <w:r>
-        <w:rPr>
-          <w:rFonts w:ascii="Times New Roman" w:hAnsi="Times New Roman" w:cs="Times New Roman"/>
-          <w:color w:val="0070C0"/>
-          <w:sz w:val="24"/>
-          <w:szCs w:val="24"/>
-        </w:rPr>
-        <w:t>We have changed the original Line 525 to: “</w:t>
-      </w:r>
-      <w:r>
-        <w:rPr>
-          <w:rFonts w:ascii="Times New Roman" w:hAnsi="Times New Roman" w:cs="Times New Roman"/>
-          <w:i/>
-          <w:iCs/>
-          <w:color w:val="0070C0"/>
-          <w:sz w:val="24"/>
-          <w:szCs w:val="24"/>
-          <w:lang w:val="en-US"/>
-        </w:rPr>
-        <w:t>There was no evidence that mitochondrial respiratory function was impacted by the developmental stage when nutritional manipulations were applied (Fig. 7C).</w:t>
-      </w:r>
-      <w:r>
-        <w:rPr>
-          <w:rFonts w:ascii="Times New Roman" w:hAnsi="Times New Roman" w:cs="Times New Roman"/>
-          <w:color w:val="0070C0"/>
-          <w:sz w:val="24"/>
-          <w:szCs w:val="24"/>
-          <w:lang w:val="en-US"/>
-        </w:rPr>
-        <w:t>”</w:t>
-      </w:r>
-    </w:p>
-    <w:p>
-      <w:pPr>
-        <w:spacing w:after="0"/>
-        <w:rPr>
-          <w:rFonts w:ascii="Times New Roman" w:hAnsi="Times New Roman" w:cs="Times New Roman"/>
-          <w:sz w:val="24"/>
-          <w:szCs w:val="24"/>
-        </w:rPr>
-      </w:pPr>
-    </w:p>
-    <w:p>
-      <w:pPr>
-        <w:spacing w:after="0"/>
-        <w:rPr>
-          <w:rFonts w:ascii="Times New Roman" w:hAnsi="Times New Roman" w:cs="Times New Roman"/>
-          <w:sz w:val="24"/>
-          <w:szCs w:val="24"/>
-        </w:rPr>
-      </w:pPr>
-      <w:r>
-        <w:rPr>
-          <w:rFonts w:ascii="Times New Roman" w:hAnsi="Times New Roman" w:cs="Times New Roman"/>
-          <w:sz w:val="24"/>
-          <w:szCs w:val="24"/>
-          <w:highlight w:val="green"/>
-        </w:rPr>
-        <w:t>Figure 8 would be clearer if "nutritional stressors" was written at the top of the figure as in the other ones.</w:t>
-      </w:r>
-      <w:r>
-        <w:rPr>
-          <w:rFonts w:ascii="Times New Roman" w:hAnsi="Times New Roman" w:cs="Times New Roman"/>
-          <w:sz w:val="24"/>
-          <w:szCs w:val="24"/>
-        </w:rPr>
-        <w:t xml:space="preserve"> </w:t>
-      </w:r>
-    </w:p>
-    <w:p>
-      <w:pPr>
-        <w:spacing w:after="0"/>
-        <w:rPr>
-          <w:rFonts w:ascii="Times New Roman" w:hAnsi="Times New Roman" w:cs="Times New Roman"/>
-          <w:sz w:val="24"/>
-          <w:szCs w:val="24"/>
-        </w:rPr>
-      </w:pPr>
-      <w:commentRangeStart w:id="5"/>
-      <w:r>
-        <w:rPr>
-          <w:rFonts w:ascii="Times New Roman" w:hAnsi="Times New Roman" w:cs="Times New Roman"/>
-          <w:sz w:val="24"/>
-          <w:szCs w:val="24"/>
-        </w:rPr>
-        <w:t>Dan</w:t>
-      </w:r>
-      <w:commentRangeEnd w:id="5"/>
-      <w:r>
-        <w:rPr>
-          <w:rStyle w:val="CommentReference"/>
-        </w:rPr>
-        <w:commentReference w:id="5"/>
-      </w:r>
-    </w:p>
-    <w:p>
-      <w:pPr>
-        <w:spacing w:after="0"/>
-        <w:rPr>
-          <w:rFonts w:ascii="Times New Roman" w:hAnsi="Times New Roman" w:cs="Times New Roman"/>
-          <w:sz w:val="24"/>
-          <w:szCs w:val="24"/>
-        </w:rPr>
-      </w:pPr>
-    </w:p>
-    <w:p>
-      <w:pPr>
-        <w:spacing w:after="0"/>
-        <w:rPr>
-          <w:rFonts w:ascii="Times New Roman" w:hAnsi="Times New Roman" w:cs="Times New Roman"/>
-          <w:sz w:val="24"/>
-          <w:szCs w:val="24"/>
-        </w:rPr>
-      </w:pPr>
-      <w:r>
-        <w:rPr>
-          <w:rFonts w:ascii="Times New Roman" w:hAnsi="Times New Roman" w:cs="Times New Roman"/>
-          <w:sz w:val="24"/>
-          <w:szCs w:val="24"/>
-        </w:rPr>
-        <w:t xml:space="preserve">Discussion sentence starting line 573 is missing a comma or a period. </w:t>
-      </w:r>
-    </w:p>
-    <w:p>
-      <w:pPr>
-        <w:spacing w:after="0"/>
-        <w:rPr>
-          <w:rFonts w:ascii="Times New Roman" w:hAnsi="Times New Roman" w:cs="Times New Roman"/>
-          <w:color w:val="0070C0"/>
-          <w:sz w:val="24"/>
-          <w:szCs w:val="24"/>
-        </w:rPr>
-      </w:pPr>
-      <w:r>
-        <w:rPr>
-          <w:rFonts w:ascii="Times New Roman" w:hAnsi="Times New Roman" w:cs="Times New Roman"/>
-          <w:color w:val="0070C0"/>
-          <w:sz w:val="24"/>
-          <w:szCs w:val="24"/>
-        </w:rPr>
-        <w:t xml:space="preserve">Thanks for catching this. We’ve removed the second “glucocorticoids” from the sentence which means it no longer requires a comma. </w:t>
-      </w:r>
-      <w:r>
-        <w:rPr>
-          <w:rFonts w:ascii="Times New Roman" w:hAnsi="Times New Roman" w:cs="Times New Roman"/>
-          <w:color w:val="0070C0"/>
-          <w:sz w:val="24"/>
-          <w:szCs w:val="24"/>
-        </w:rPr>
-        <w:t xml:space="preserve">The sentence is now written: </w:t>
-      </w:r>
-      <w:r>
-        <w:rPr>
-          <w:rFonts w:ascii="Times New Roman" w:hAnsi="Times New Roman" w:cs="Times New Roman"/>
-          <w:color w:val="0070C0"/>
-          <w:sz w:val="24"/>
-          <w:szCs w:val="24"/>
-        </w:rPr>
-        <w:t>“</w:t>
-      </w:r>
-      <w:r>
-        <w:rPr>
-          <w:rFonts w:ascii="Times New Roman" w:hAnsi="Times New Roman" w:cs="Times New Roman"/>
-          <w:i/>
-          <w:iCs/>
-          <w:color w:val="0070C0"/>
-          <w:sz w:val="24"/>
-          <w:szCs w:val="24"/>
-          <w:lang w:val="en-US"/>
-        </w:rPr>
-        <w:t>Glucocorticoids and mitochondria are intrinsically linked because glucocorticoids are synthesized by mitochondria and modulate the availability of energy organisms need to cope with stressors through genomic and non-genomic effects on mitochondrial respiratory function.”</w:t>
-      </w:r>
-    </w:p>
-    <w:p>
-      <w:pPr>
-        <w:spacing w:after="0"/>
-        <w:rPr>
-          <w:rFonts w:ascii="Times New Roman" w:hAnsi="Times New Roman" w:cs="Times New Roman"/>
-          <w:sz w:val="24"/>
-          <w:szCs w:val="24"/>
-        </w:rPr>
-      </w:pPr>
-    </w:p>
-    <w:p>
-      <w:pPr>
-        <w:spacing w:after="0"/>
-        <w:rPr>
-          <w:rFonts w:ascii="Times New Roman" w:hAnsi="Times New Roman" w:cs="Times New Roman"/>
-          <w:sz w:val="24"/>
-          <w:szCs w:val="24"/>
-        </w:rPr>
-      </w:pPr>
-      <w:r>
-        <w:rPr>
-          <w:rFonts w:ascii="Times New Roman" w:hAnsi="Times New Roman" w:cs="Times New Roman"/>
-          <w:sz w:val="24"/>
-          <w:szCs w:val="24"/>
-          <w:highlight w:val="green"/>
-        </w:rPr>
-        <w:t>SI: might be good to explain what the heterogeneity "CV" and "M2" parameters are.</w:t>
-      </w:r>
-      <w:r>
-        <w:rPr>
-          <w:rFonts w:ascii="Times New Roman" w:hAnsi="Times New Roman" w:cs="Times New Roman"/>
-          <w:sz w:val="24"/>
-          <w:szCs w:val="24"/>
-        </w:rPr>
-        <w:t xml:space="preserve"> </w:t>
-      </w:r>
-    </w:p>
-    <w:p>
-      <w:pPr>
-        <w:spacing w:after="0"/>
-        <w:rPr>
-          <w:rFonts w:ascii="Times New Roman" w:hAnsi="Times New Roman" w:cs="Times New Roman"/>
-          <w:sz w:val="24"/>
-          <w:szCs w:val="24"/>
-        </w:rPr>
-      </w:pPr>
-      <w:commentRangeStart w:id="6"/>
-      <w:r>
-        <w:rPr>
-          <w:rFonts w:ascii="Times New Roman" w:hAnsi="Times New Roman" w:cs="Times New Roman"/>
-          <w:color w:val="0070C0"/>
-          <w:sz w:val="24"/>
-          <w:szCs w:val="24"/>
-        </w:rPr>
-        <w:t xml:space="preserve">We now define “CV” and “M2” in the table legends in the Supplemental Materials. </w:t>
-      </w:r>
-      <w:commentRangeEnd w:id="6"/>
-      <w:r>
-        <w:rPr>
-          <w:rStyle w:val="CommentReference"/>
-          <w:color w:val="0070C0"/>
-        </w:rPr>
-        <w:commentReference w:id="6"/>
-      </w:r>
-    </w:p>
-    <w:p>
-      <w:pPr>
-        <w:spacing w:after="0"/>
-        <w:rPr>
-          <w:rFonts w:ascii="Times New Roman" w:hAnsi="Times New Roman" w:cs="Times New Roman"/>
-          <w:sz w:val="24"/>
-          <w:szCs w:val="24"/>
-        </w:rPr>
-      </w:pPr>
-    </w:p>
-    <w:p>
-      <w:pPr>
-        <w:spacing w:after="0"/>
-        <w:rPr>
-          <w:rFonts w:ascii="Times New Roman" w:hAnsi="Times New Roman" w:cs="Times New Roman"/>
-          <w:sz w:val="24"/>
-          <w:szCs w:val="24"/>
-        </w:rPr>
-      </w:pPr>
-      <w:r>
-        <w:rPr>
-          <w:rFonts w:ascii="Times New Roman" w:hAnsi="Times New Roman" w:cs="Times New Roman"/>
-          <w:sz w:val="24"/>
-          <w:szCs w:val="24"/>
-        </w:rPr>
-        <w:t>SI lines 43-44: check the reference to the figures, as it seems wrong (not figure 8 and should be SI figure 1D).</w:t>
-      </w:r>
-      <w:r>
-        <w:rPr>
-          <w:rFonts w:ascii="Times New Roman" w:hAnsi="Times New Roman" w:cs="Times New Roman"/>
-          <w:sz w:val="24"/>
-          <w:szCs w:val="24"/>
-        </w:rPr>
-        <w:t xml:space="preserve"> </w:t>
-      </w:r>
-    </w:p>
-    <w:p>
-      <w:pPr>
-        <w:spacing w:after="0"/>
-        <w:rPr>
-          <w:rFonts w:ascii="Times New Roman" w:hAnsi="Times New Roman" w:cs="Times New Roman"/>
           <w:color w:val="0070C0"/>
           <w:sz w:val="24"/>
           <w:szCs w:val="24"/>
@@ -3769,7 +3914,6 @@
           <w:sz w:val="24"/>
           <w:szCs w:val="24"/>
         </w:rPr>
-        <w:lastRenderedPageBreak/>
         <w:t xml:space="preserve">Thank you for the thoughtful review and helpful comments. </w:t>
       </w:r>
     </w:p>
@@ -3785,7 +3929,7 @@
 
 <file path=word/comments.xml><?xml version="1.0" encoding="utf-8"?>
 <w:comments xmlns:wpc="http://schemas.microsoft.com/office/word/2010/wordprocessingCanvas" xmlns:cx="http://schemas.microsoft.com/office/drawing/2014/chartex" xmlns:cx1="http://schemas.microsoft.com/office/drawing/2015/9/8/chartex" xmlns:cx2="http://schemas.microsoft.com/office/drawing/2015/10/21/chartex" xmlns:cx3="http://schemas.microsoft.com/office/drawing/2016/5/9/chartex" xmlns:cx4="http://schemas.microsoft.com/office/drawing/2016/5/10/chartex" xmlns:cx5="http://schemas.microsoft.com/office/drawing/2016/5/11/chartex" xmlns:cx6="http://schemas.microsoft.com/office/drawing/2016/5/12/chartex" xmlns:cx7="http://schemas.microsoft.com/office/drawing/2016/5/13/chartex" xmlns:cx8="http://schemas.microsoft.com/office/drawing/2016/5/14/chartex" xmlns:mc="http://schemas.openxmlformats.org/markup-compatibility/2006" xmlns:aink="http://schemas.microsoft.com/office/drawing/2016/ink" xmlns:am3d="http://schemas.microsoft.com/office/drawing/2017/model3d" xmlns:o="urn:schemas-microsoft-com:office:office" xmlns:oel="http://schemas.microsoft.com/office/2019/extlst" xmlns:r="http://schemas.openxmlformats.org/officeDocument/2006/relationships" xmlns:m="http://schemas.openxmlformats.org/officeDocument/2006/math" xmlns:v="urn:schemas-microsoft-com:vml" xmlns:wp14="http://schemas.microsoft.com/office/word/2010/wordprocessingDrawing" xmlns:wp="http://schemas.openxmlformats.org/drawingml/2006/wordprocessingDrawing" xmlns:w10="urn:schemas-microsoft-com:office:word" xmlns:w="http://schemas.openxmlformats.org/wordprocessingml/2006/main" xmlns:w14="http://schemas.microsoft.com/office/word/2010/wordml" xmlns:w15="http://schemas.microsoft.com/office/word/2012/wordml" xmlns:w16cex="http://schemas.microsoft.com/office/word/2018/wordml/cex" xmlns:w16cid="http://schemas.microsoft.com/office/word/2016/wordml/cid" xmlns:w16="http://schemas.microsoft.com/office/word/2018/wordml" xmlns:w16du="http://schemas.microsoft.com/office/word/2023/wordml/word16du" xmlns:w16sdtdh="http://schemas.microsoft.com/office/word/2020/wordml/sdtdatahash" xmlns:w16sdtfl="http://schemas.microsoft.com/office/word/2024/wordml/sdtformatlock" xmlns:w16se="http://schemas.microsoft.com/office/word/2015/wordml/symex" xmlns:wpg="http://schemas.microsoft.com/office/word/2010/wordprocessingGroup" xmlns:wpi="http://schemas.microsoft.com/office/word/2010/wordprocessingInk" xmlns:wne="http://schemas.microsoft.com/office/word/2006/wordml" xmlns:wps="http://schemas.microsoft.com/office/word/2010/wordprocessingShape" mc:Ignorable="w14 w15 w16se w16cid w16 w16cex w16sdtdh w16sdtfl w16du wp14">
-  <w:comment w:id="0" w:author="Ondi Crino" w:date="2026-01-27T08:55:00Z" w:initials="OC">
+  <w:comment w:id="0" w:author="Daniel Noble" w:date="2026-01-28T11:33:00Z" w:initials="DN">
     <w:p>
       <w:pPr>
         <w:pStyle w:val="CommentText"/>
@@ -3797,7 +3941,7 @@
         <w:annotationRef/>
       </w:r>
       <w:r>
-        <w:t>Hi Dan, I can take a stab at this one, but I feel like A) we did this, and B) if we need to elaborate more, this one may be more up your alley</w:t>
+        <w:t>Probably just need to add this and that’s it.</w:t>
       </w:r>
     </w:p>
   </w:comment>
@@ -3930,7 +4074,7 @@
       </w:r>
     </w:p>
   </w:comment>
-  <w:comment w:id="2" w:author="Ondi Crino" w:date="2026-01-26T13:22:00Z" w:initials="OC">
+  <w:comment w:id="2" w:author="Daniel Noble" w:date="2026-01-28T15:42:00Z" w:initials="DN">
     <w:p>
       <w:pPr>
         <w:pStyle w:val="CommentText"/>
@@ -3942,11 +4086,53 @@
         <w:annotationRef/>
       </w:r>
       <w:r>
+        <w:t>Think this is pretty clear so kept it simple and just added a note after raw data. Think that will do it. Making all black maybe hard to see.</w:t>
+      </w:r>
+    </w:p>
+    <w:p>
+      <w:pPr>
+        <w:pStyle w:val="CommentText"/>
+      </w:pPr>
+    </w:p>
+    <w:p>
+      <w:pPr>
+        <w:pStyle w:val="CommentText"/>
+      </w:pPr>
+      <w:r>
+        <w:t>Also, I noticed all the titles were not what I had in the code so I updated all those to be consistent.</w:t>
+      </w:r>
+    </w:p>
+    <w:p>
+      <w:pPr>
+        <w:pStyle w:val="CommentText"/>
+      </w:pPr>
+    </w:p>
+    <w:p>
+      <w:pPr>
+        <w:pStyle w:val="CommentText"/>
+      </w:pPr>
+      <w:r>
+        <w:t>I think it’s fine to add significance, and I did for all figures. It can be hard to know if CI’s cross so this is a good check</w:t>
+      </w:r>
+    </w:p>
+  </w:comment>
+  <w:comment w:id="3" w:author="Ondi Crino" w:date="2026-01-26T13:22:00Z" w:initials="OC">
+    <w:p>
+      <w:pPr>
+        <w:pStyle w:val="CommentText"/>
+      </w:pPr>
+      <w:r>
+        <w:rPr>
+          <w:rStyle w:val="CommentReference"/>
+        </w:rPr>
+        <w:annotationRef/>
+      </w:r>
+      <w:r>
         <w:t xml:space="preserve">Dan, I feel ambivalent about this comment. What do you think? </w:t>
       </w:r>
     </w:p>
   </w:comment>
-  <w:comment w:id="3" w:author="Ondi Crino" w:date="2026-01-26T12:39:00Z" w:initials="OC">
+  <w:comment w:id="4" w:author="Daniel Noble" w:date="2026-01-28T13:40:00Z" w:initials="DN">
     <w:p>
       <w:pPr>
         <w:pStyle w:val="CommentText"/>
@@ -3958,11 +4144,27 @@
         <w:annotationRef/>
       </w:r>
       <w:r>
+        <w:t>Agree Don’t think we need to do this one.</w:t>
+      </w:r>
+    </w:p>
+  </w:comment>
+  <w:comment w:id="5" w:author="Ondi Crino" w:date="2026-01-26T12:39:00Z" w:initials="OC">
+    <w:p>
+      <w:pPr>
+        <w:pStyle w:val="CommentText"/>
+      </w:pPr>
+      <w:r>
+        <w:rPr>
+          <w:rStyle w:val="CommentReference"/>
+        </w:rPr>
+        <w:annotationRef/>
+      </w:r>
+      <w:r>
         <w:t xml:space="preserve">Hi Dan, I can’t tell from the figure if I’ve made a mistake in the text or if the referee is mistaken? Can you double check the results? </w:t>
       </w:r>
     </w:p>
   </w:comment>
-  <w:comment w:id="4" w:author="Ondi Crino" w:date="2026-01-26T12:41:00Z" w:initials="OC">
+  <w:comment w:id="6" w:author="Daniel Noble" w:date="2026-01-28T15:24:00Z" w:initials="DN">
     <w:p>
       <w:pPr>
         <w:pStyle w:val="CommentText"/>
@@ -3974,11 +4176,14 @@
         <w:annotationRef/>
       </w:r>
       <w:r>
-        <w:t xml:space="preserve">Dan, I feel ambivalent about this. On one hand it’s nice to have them all in the same order regardless of effect size, but I could see how it may be easier to understand the effects without reading the text if they were ranked from most to least. What do you think? </w:t>
+        <w:t xml:space="preserve">Actually, it’s both! </w:t>
+      </w:r>
+      <w:r>
+        <w:t>Added the new results text and updated fig with p-values</w:t>
       </w:r>
     </w:p>
   </w:comment>
-  <w:comment w:id="5" w:author="Ondi Crino" w:date="2026-01-26T12:41:00Z" w:initials="OC">
+  <w:comment w:id="7" w:author="Ondi Crino" w:date="2026-01-27T13:39:00Z" w:initials="OC">
     <w:p>
       <w:pPr>
         <w:pStyle w:val="CommentText"/>
@@ -3990,11 +4195,11 @@
         <w:annotationRef/>
       </w:r>
       <w:r>
-        <w:t xml:space="preserve">Dan, can you make this change? </w:t>
+        <w:t>Dan, I took at crack at this but it’s likely that you can edit it to make it better. Can you please have a look?</w:t>
       </w:r>
     </w:p>
   </w:comment>
-  <w:comment w:id="6" w:author="Ondi Crino" w:date="2026-01-27T13:39:00Z" w:initials="OC">
+  <w:comment w:id="8" w:author="Daniel Noble" w:date="2026-01-28T11:28:00Z" w:initials="DN">
     <w:p>
       <w:pPr>
         <w:pStyle w:val="CommentText"/>
@@ -4006,7 +4211,7 @@
         <w:annotationRef/>
       </w:r>
       <w:r>
-        <w:t>Dan, I took at crack at this but it’s likely that you can edit it to make it better. Can you please have a look?</w:t>
+        <w:t>Looks good. I just edited a bit more. Should be good now, but you will just need to add the Yang et al. 2025 paper in there for the citation.</w:t>
       </w:r>
     </w:p>
   </w:comment>
@@ -4015,42 +4220,172 @@
 
 <file path=word/commentsExtended.xml><?xml version="1.0" encoding="utf-8"?>
 <w15:commentsEx xmlns:wpc="http://schemas.microsoft.com/office/word/2010/wordprocessingCanvas" xmlns:cx="http://schemas.microsoft.com/office/drawing/2014/chartex" xmlns:cx1="http://schemas.microsoft.com/office/drawing/2015/9/8/chartex" xmlns:cx2="http://schemas.microsoft.com/office/drawing/2015/10/21/chartex" xmlns:cx3="http://schemas.microsoft.com/office/drawing/2016/5/9/chartex" xmlns:cx4="http://schemas.microsoft.com/office/drawing/2016/5/10/chartex" xmlns:cx5="http://schemas.microsoft.com/office/drawing/2016/5/11/chartex" xmlns:cx6="http://schemas.microsoft.com/office/drawing/2016/5/12/chartex" xmlns:cx7="http://schemas.microsoft.com/office/drawing/2016/5/13/chartex" xmlns:cx8="http://schemas.microsoft.com/office/drawing/2016/5/14/chartex" xmlns:mc="http://schemas.openxmlformats.org/markup-compatibility/2006" xmlns:aink="http://schemas.microsoft.com/office/drawing/2016/ink" xmlns:am3d="http://schemas.microsoft.com/office/drawing/2017/model3d" xmlns:o="urn:schemas-microsoft-com:office:office" xmlns:oel="http://schemas.microsoft.com/office/2019/extlst" xmlns:r="http://schemas.openxmlformats.org/officeDocument/2006/relationships" xmlns:m="http://schemas.openxmlformats.org/officeDocument/2006/math" xmlns:v="urn:schemas-microsoft-com:vml" xmlns:wp14="http://schemas.microsoft.com/office/word/2010/wordprocessingDrawing" xmlns:wp="http://schemas.openxmlformats.org/drawingml/2006/wordprocessingDrawing" xmlns:w10="urn:schemas-microsoft-com:office:word" xmlns:w="http://schemas.openxmlformats.org/wordprocessingml/2006/main" xmlns:w14="http://schemas.microsoft.com/office/word/2010/wordml" xmlns:w15="http://schemas.microsoft.com/office/word/2012/wordml" xmlns:w16cex="http://schemas.microsoft.com/office/word/2018/wordml/cex" xmlns:w16cid="http://schemas.microsoft.com/office/word/2016/wordml/cid" xmlns:w16="http://schemas.microsoft.com/office/word/2018/wordml" xmlns:w16du="http://schemas.microsoft.com/office/word/2023/wordml/word16du" xmlns:w16sdtdh="http://schemas.microsoft.com/office/word/2020/wordml/sdtdatahash" xmlns:w16sdtfl="http://schemas.microsoft.com/office/word/2024/wordml/sdtformatlock" xmlns:w16se="http://schemas.microsoft.com/office/word/2015/wordml/symex" xmlns:wpg="http://schemas.microsoft.com/office/word/2010/wordprocessingGroup" xmlns:wpi="http://schemas.microsoft.com/office/word/2010/wordprocessingInk" xmlns:wne="http://schemas.microsoft.com/office/word/2006/wordml" xmlns:wps="http://schemas.microsoft.com/office/word/2010/wordprocessingShape" mc:Ignorable="w14 w15 w16se w16cid w16 w16cex w16sdtdh w16sdtfl w16du wp14">
-  <w15:commentEx w15:paraId="654EFDE3" w15:done="0"/>
+  <w15:commentEx w15:paraId="77F0BD8E" w15:done="0"/>
   <w15:commentEx w15:paraId="2DFFA54D" w15:done="0"/>
+  <w15:commentEx w15:paraId="4BCE1FF4" w15:paraIdParent="2DFFA54D" w15:done="0"/>
   <w15:commentEx w15:paraId="734D38D9" w15:done="0"/>
+  <w15:commentEx w15:paraId="2FF14E01" w15:paraIdParent="734D38D9" w15:done="0"/>
   <w15:commentEx w15:paraId="4E921352" w15:done="0"/>
-  <w15:commentEx w15:paraId="692FE44A" w15:done="0"/>
-  <w15:commentEx w15:paraId="4BCC3673" w15:done="0"/>
+  <w15:commentEx w15:paraId="2D592094" w15:paraIdParent="4E921352" w15:done="0"/>
   <w15:commentEx w15:paraId="1D2892C4" w15:done="0"/>
+  <w15:commentEx w15:paraId="47530AD5" w15:paraIdParent="1D2892C4" w15:done="0"/>
 </w15:commentsEx>
 </file>
 
 <file path=word/commentsExtensible.xml><?xml version="1.0" encoding="utf-8"?>
 <w16cex:commentsExtensible xmlns:wpc="http://schemas.microsoft.com/office/word/2010/wordprocessingCanvas" xmlns:cx="http://schemas.microsoft.com/office/drawing/2014/chartex" xmlns:cx1="http://schemas.microsoft.com/office/drawing/2015/9/8/chartex" xmlns:cx2="http://schemas.microsoft.com/office/drawing/2015/10/21/chartex" xmlns:cx3="http://schemas.microsoft.com/office/drawing/2016/5/9/chartex" xmlns:cx4="http://schemas.microsoft.com/office/drawing/2016/5/10/chartex" xmlns:cx5="http://schemas.microsoft.com/office/drawing/2016/5/11/chartex" xmlns:cx6="http://schemas.microsoft.com/office/drawing/2016/5/12/chartex" xmlns:cx7="http://schemas.microsoft.com/office/drawing/2016/5/13/chartex" xmlns:cx8="http://schemas.microsoft.com/office/drawing/2016/5/14/chartex" xmlns:cr="http://schemas.microsoft.com/office/comments/2020/reactions" xmlns:mc="http://schemas.openxmlformats.org/markup-compatibility/2006" xmlns:aink="http://schemas.microsoft.com/office/drawing/2016/ink" xmlns:am3d="http://schemas.microsoft.com/office/drawing/2017/model3d" xmlns:o="urn:schemas-microsoft-com:office:office" xmlns:oel="http://schemas.microsoft.com/office/2019/extlst" xmlns:r="http://schemas.openxmlformats.org/officeDocument/2006/relationships" xmlns:m="http://schemas.openxmlformats.org/officeDocument/2006/math" xmlns:v="urn:schemas-microsoft-com:vml" xmlns:wp14="http://schemas.microsoft.com/office/word/2010/wordprocessingDrawing" xmlns:wp="http://schemas.openxmlformats.org/drawingml/2006/wordprocessingDrawing" xmlns:w10="urn:schemas-microsoft-com:office:word" xmlns:w="http://schemas.openxmlformats.org/wordprocessingml/2006/main" xmlns:w14="http://schemas.microsoft.com/office/word/2010/wordml" xmlns:w15="http://schemas.microsoft.com/office/word/2012/wordml" xmlns:w16cex="http://schemas.microsoft.com/office/word/2018/wordml/cex" xmlns:w16cid="http://schemas.microsoft.com/office/word/2016/wordml/cid" xmlns:w16="http://schemas.microsoft.com/office/word/2018/wordml" xmlns:w16du="http://schemas.microsoft.com/office/word/2023/wordml/word16du" xmlns:w16sdtdh="http://schemas.microsoft.com/office/word/2020/wordml/sdtdatahash" xmlns:w16sdtfl="http://schemas.microsoft.com/office/word/2024/wordml/sdtformatlock" xmlns:w16se="http://schemas.microsoft.com/office/word/2015/wordml/symex" xmlns:wpg="http://schemas.microsoft.com/office/word/2010/wordprocessingGroup" xmlns:wpi="http://schemas.microsoft.com/office/word/2010/wordprocessingInk" xmlns:wne="http://schemas.microsoft.com/office/word/2006/wordml" xmlns:wps="http://schemas.microsoft.com/office/word/2010/wordprocessingShape" mc:Ignorable="w14 w15 w16se w16cid w16 w16cex w16sdtdh w16sdtfl cr w16du wp14">
-  <w16cex:commentExtensible w16cex:durableId="512DE4A4" w16cex:dateUtc="2026-01-26T22:25:00Z"/>
+  <w16cex:commentExtensible w16cex:durableId="30716FDB" w16cex:dateUtc="2026-01-28T10:33:00Z"/>
   <w16cex:commentExtensible w16cex:durableId="158EDF78" w16cex:dateUtc="2026-01-26T02:48:00Z"/>
+  <w16cex:commentExtensible w16cex:durableId="57C267C1" w16cex:dateUtc="2026-01-28T14:42:00Z"/>
   <w16cex:commentExtensible w16cex:durableId="593A618E" w16cex:dateUtc="2026-01-26T02:52:00Z"/>
+  <w16cex:commentExtensible w16cex:durableId="24CA1A19" w16cex:dateUtc="2026-01-28T12:40:00Z"/>
   <w16cex:commentExtensible w16cex:durableId="6CD36E5C" w16cex:dateUtc="2026-01-26T02:09:00Z"/>
-  <w16cex:commentExtensible w16cex:durableId="37A86A6D" w16cex:dateUtc="2026-01-26T02:11:00Z"/>
-  <w16cex:commentExtensible w16cex:durableId="24CFB59C" w16cex:dateUtc="2026-01-26T02:11:00Z"/>
+  <w16cex:commentExtensible w16cex:durableId="2A0DB842" w16cex:dateUtc="2026-01-28T14:24:00Z"/>
   <w16cex:commentExtensible w16cex:durableId="7271CBF6" w16cex:dateUtc="2026-01-27T03:09:00Z"/>
+  <w16cex:commentExtensible w16cex:durableId="369F27FF" w16cex:dateUtc="2026-01-28T10:28:00Z"/>
 </w16cex:commentsExtensible>
 </file>
 
 <file path=word/commentsIds.xml><?xml version="1.0" encoding="utf-8"?>
 <w16cid:commentsIds xmlns:wpc="http://schemas.microsoft.com/office/word/2010/wordprocessingCanvas" xmlns:cx="http://schemas.microsoft.com/office/drawing/2014/chartex" xmlns:cx1="http://schemas.microsoft.com/office/drawing/2015/9/8/chartex" xmlns:cx2="http://schemas.microsoft.com/office/drawing/2015/10/21/chartex" xmlns:cx3="http://schemas.microsoft.com/office/drawing/2016/5/9/chartex" xmlns:cx4="http://schemas.microsoft.com/office/drawing/2016/5/10/chartex" xmlns:cx5="http://schemas.microsoft.com/office/drawing/2016/5/11/chartex" xmlns:cx6="http://schemas.microsoft.com/office/drawing/2016/5/12/chartex" xmlns:cx7="http://schemas.microsoft.com/office/drawing/2016/5/13/chartex" xmlns:cx8="http://schemas.microsoft.com/office/drawing/2016/5/14/chartex" xmlns:mc="http://schemas.openxmlformats.org/markup-compatibility/2006" xmlns:aink="http://schemas.microsoft.com/office/drawing/2016/ink" xmlns:am3d="http://schemas.microsoft.com/office/drawing/2017/model3d" xmlns:o="urn:schemas-microsoft-com:office:office" xmlns:oel="http://schemas.microsoft.com/office/2019/extlst" xmlns:r="http://schemas.openxmlformats.org/officeDocument/2006/relationships" xmlns:m="http://schemas.openxmlformats.org/officeDocument/2006/math" xmlns:v="urn:schemas-microsoft-com:vml" xmlns:wp14="http://schemas.microsoft.com/office/word/2010/wordprocessingDrawing" xmlns:wp="http://schemas.openxmlformats.org/drawingml/2006/wordprocessingDrawing" xmlns:w10="urn:schemas-microsoft-com:office:word" xmlns:w="http://schemas.openxmlformats.org/wordprocessingml/2006/main" xmlns:w14="http://schemas.microsoft.com/office/word/2010/wordml" xmlns:w15="http://schemas.microsoft.com/office/word/2012/wordml" xmlns:w16cex="http://schemas.microsoft.com/office/word/2018/wordml/cex" xmlns:w16cid="http://schemas.microsoft.com/office/word/2016/wordml/cid" xmlns:w16="http://schemas.microsoft.com/office/word/2018/wordml" xmlns:w16du="http://schemas.microsoft.com/office/word/2023/wordml/word16du" xmlns:w16sdtdh="http://schemas.microsoft.com/office/word/2020/wordml/sdtdatahash" xmlns:w16sdtfl="http://schemas.microsoft.com/office/word/2024/wordml/sdtformatlock" xmlns:w16se="http://schemas.microsoft.com/office/word/2015/wordml/symex" xmlns:wpg="http://schemas.microsoft.com/office/word/2010/wordprocessingGroup" xmlns:wpi="http://schemas.microsoft.com/office/word/2010/wordprocessingInk" xmlns:wne="http://schemas.microsoft.com/office/word/2006/wordml" xmlns:wps="http://schemas.microsoft.com/office/word/2010/wordprocessingShape" mc:Ignorable="w14 w15 w16se w16cid w16 w16cex w16sdtdh w16sdtfl w16du wp14">
-  <w16cid:commentId w16cid:paraId="654EFDE3" w16cid:durableId="512DE4A4"/>
+  <w16cid:commentId w16cid:paraId="77F0BD8E" w16cid:durableId="30716FDB"/>
   <w16cid:commentId w16cid:paraId="2DFFA54D" w16cid:durableId="158EDF78"/>
+  <w16cid:commentId w16cid:paraId="4BCE1FF4" w16cid:durableId="57C267C1"/>
   <w16cid:commentId w16cid:paraId="734D38D9" w16cid:durableId="593A618E"/>
+  <w16cid:commentId w16cid:paraId="2FF14E01" w16cid:durableId="24CA1A19"/>
   <w16cid:commentId w16cid:paraId="4E921352" w16cid:durableId="6CD36E5C"/>
-  <w16cid:commentId w16cid:paraId="692FE44A" w16cid:durableId="37A86A6D"/>
-  <w16cid:commentId w16cid:paraId="4BCC3673" w16cid:durableId="24CFB59C"/>
+  <w16cid:commentId w16cid:paraId="2D592094" w16cid:durableId="2A0DB842"/>
   <w16cid:commentId w16cid:paraId="1D2892C4" w16cid:durableId="7271CBF6"/>
+  <w16cid:commentId w16cid:paraId="47530AD5" w16cid:durableId="369F27FF"/>
 </w16cid:commentsIds>
+</file>
+
+<file path=word/numbering.xml><?xml version="1.0" encoding="utf-8"?>
+<w:numbering xmlns:wpc="http://schemas.microsoft.com/office/word/2010/wordprocessingCanvas" xmlns:cx="http://schemas.microsoft.com/office/drawing/2014/chartex" xmlns:cx1="http://schemas.microsoft.com/office/drawing/2015/9/8/chartex" xmlns:cx2="http://schemas.microsoft.com/office/drawing/2015/10/21/chartex" xmlns:cx3="http://schemas.microsoft.com/office/drawing/2016/5/9/chartex" xmlns:cx4="http://schemas.microsoft.com/office/drawing/2016/5/10/chartex" xmlns:cx5="http://schemas.microsoft.com/office/drawing/2016/5/11/chartex" xmlns:cx6="http://schemas.microsoft.com/office/drawing/2016/5/12/chartex" xmlns:cx7="http://schemas.microsoft.com/office/drawing/2016/5/13/chartex" xmlns:cx8="http://schemas.microsoft.com/office/drawing/2016/5/14/chartex" xmlns:mc="http://schemas.openxmlformats.org/markup-compatibility/2006" xmlns:aink="http://schemas.microsoft.com/office/drawing/2016/ink" xmlns:am3d="http://schemas.microsoft.com/office/drawing/2017/model3d" xmlns:o="urn:schemas-microsoft-com:office:office" xmlns:oel="http://schemas.microsoft.com/office/2019/extlst" xmlns:r="http://schemas.openxmlformats.org/officeDocument/2006/relationships" xmlns:m="http://schemas.openxmlformats.org/officeDocument/2006/math" xmlns:v="urn:schemas-microsoft-com:vml" xmlns:wp14="http://schemas.microsoft.com/office/word/2010/wordprocessingDrawing" xmlns:wp="http://schemas.openxmlformats.org/drawingml/2006/wordprocessingDrawing" xmlns:w10="urn:schemas-microsoft-com:office:word" xmlns:w="http://schemas.openxmlformats.org/wordprocessingml/2006/main" xmlns:w14="http://schemas.microsoft.com/office/word/2010/wordml" xmlns:w15="http://schemas.microsoft.com/office/word/2012/wordml" xmlns:w16cex="http://schemas.microsoft.com/office/word/2018/wordml/cex" xmlns:w16cid="http://schemas.microsoft.com/office/word/2016/wordml/cid" xmlns:w16="http://schemas.microsoft.com/office/word/2018/wordml" xmlns:w16du="http://schemas.microsoft.com/office/word/2023/wordml/word16du" xmlns:w16sdtdh="http://schemas.microsoft.com/office/word/2020/wordml/sdtdatahash" xmlns:w16sdtfl="http://schemas.microsoft.com/office/word/2024/wordml/sdtformatlock" xmlns:w16se="http://schemas.microsoft.com/office/word/2015/wordml/symex" xmlns:wpg="http://schemas.microsoft.com/office/word/2010/wordprocessingGroup" xmlns:wpi="http://schemas.microsoft.com/office/word/2010/wordprocessingInk" xmlns:wne="http://schemas.microsoft.com/office/word/2006/wordml" xmlns:wps="http://schemas.microsoft.com/office/word/2010/wordprocessingShape" mc:Ignorable="w14 w15 w16se w16cid w16 w16cex w16sdtdh w16sdtfl w16du wp14">
+  <w:abstractNum w:abstractNumId="0" w15:restartNumberingAfterBreak="0">
+    <w:nsid w:val="3771297A"/>
+    <w:multiLevelType w:val="hybridMultilevel"/>
+    <w:tmpl w:val="EBB05C7E"/>
+    <w:lvl w:ilvl="0" w:tplc="08090001">
+      <w:start w:val="1"/>
+      <w:numFmt w:val="bullet"/>
+      <w:lvlText w:val=""/>
+      <w:lvlJc w:val="left"/>
+      <w:pPr>
+        <w:ind w:left="778" w:hanging="360"/>
+      </w:pPr>
+      <w:rPr>
+        <w:rFonts w:ascii="Symbol" w:hAnsi="Symbol" w:hint="default"/>
+      </w:rPr>
+    </w:lvl>
+    <w:lvl w:ilvl="1" w:tplc="08090003" w:tentative="1">
+      <w:start w:val="1"/>
+      <w:numFmt w:val="bullet"/>
+      <w:lvlText w:val="o"/>
+      <w:lvlJc w:val="left"/>
+      <w:pPr>
+        <w:ind w:left="1498" w:hanging="360"/>
+      </w:pPr>
+      <w:rPr>
+        <w:rFonts w:ascii="Courier New" w:hAnsi="Courier New" w:cs="Courier New" w:hint="default"/>
+      </w:rPr>
+    </w:lvl>
+    <w:lvl w:ilvl="2" w:tplc="08090005" w:tentative="1">
+      <w:start w:val="1"/>
+      <w:numFmt w:val="bullet"/>
+      <w:lvlText w:val=""/>
+      <w:lvlJc w:val="left"/>
+      <w:pPr>
+        <w:ind w:left="2218" w:hanging="360"/>
+      </w:pPr>
+      <w:rPr>
+        <w:rFonts w:ascii="Wingdings" w:hAnsi="Wingdings" w:hint="default"/>
+      </w:rPr>
+    </w:lvl>
+    <w:lvl w:ilvl="3" w:tplc="08090001" w:tentative="1">
+      <w:start w:val="1"/>
+      <w:numFmt w:val="bullet"/>
+      <w:lvlText w:val=""/>
+      <w:lvlJc w:val="left"/>
+      <w:pPr>
+        <w:ind w:left="2938" w:hanging="360"/>
+      </w:pPr>
+      <w:rPr>
+        <w:rFonts w:ascii="Symbol" w:hAnsi="Symbol" w:hint="default"/>
+      </w:rPr>
+    </w:lvl>
+    <w:lvl w:ilvl="4" w:tplc="08090003" w:tentative="1">
+      <w:start w:val="1"/>
+      <w:numFmt w:val="bullet"/>
+      <w:lvlText w:val="o"/>
+      <w:lvlJc w:val="left"/>
+      <w:pPr>
+        <w:ind w:left="3658" w:hanging="360"/>
+      </w:pPr>
+      <w:rPr>
+        <w:rFonts w:ascii="Courier New" w:hAnsi="Courier New" w:cs="Courier New" w:hint="default"/>
+      </w:rPr>
+    </w:lvl>
+    <w:lvl w:ilvl="5" w:tplc="08090005" w:tentative="1">
+      <w:start w:val="1"/>
+      <w:numFmt w:val="bullet"/>
+      <w:lvlText w:val=""/>
+      <w:lvlJc w:val="left"/>
+      <w:pPr>
+        <w:ind w:left="4378" w:hanging="360"/>
+      </w:pPr>
+      <w:rPr>
+        <w:rFonts w:ascii="Wingdings" w:hAnsi="Wingdings" w:hint="default"/>
+      </w:rPr>
+    </w:lvl>
+    <w:lvl w:ilvl="6" w:tplc="08090001" w:tentative="1">
+      <w:start w:val="1"/>
+      <w:numFmt w:val="bullet"/>
+      <w:lvlText w:val=""/>
+      <w:lvlJc w:val="left"/>
+      <w:pPr>
+        <w:ind w:left="5098" w:hanging="360"/>
+      </w:pPr>
+      <w:rPr>
+        <w:rFonts w:ascii="Symbol" w:hAnsi="Symbol" w:hint="default"/>
+      </w:rPr>
+    </w:lvl>
+    <w:lvl w:ilvl="7" w:tplc="08090003" w:tentative="1">
+      <w:start w:val="1"/>
+      <w:numFmt w:val="bullet"/>
+      <w:lvlText w:val="o"/>
+      <w:lvlJc w:val="left"/>
+      <w:pPr>
+        <w:ind w:left="5818" w:hanging="360"/>
+      </w:pPr>
+      <w:rPr>
+        <w:rFonts w:ascii="Courier New" w:hAnsi="Courier New" w:cs="Courier New" w:hint="default"/>
+      </w:rPr>
+    </w:lvl>
+    <w:lvl w:ilvl="8" w:tplc="08090005" w:tentative="1">
+      <w:start w:val="1"/>
+      <w:numFmt w:val="bullet"/>
+      <w:lvlText w:val=""/>
+      <w:lvlJc w:val="left"/>
+      <w:pPr>
+        <w:ind w:left="6538" w:hanging="360"/>
+      </w:pPr>
+      <w:rPr>
+        <w:rFonts w:ascii="Wingdings" w:hAnsi="Wingdings" w:hint="default"/>
+      </w:rPr>
+    </w:lvl>
+  </w:abstractNum>
+  <w:num w:numId="1" w16cid:durableId="1733195935">
+    <w:abstractNumId w:val="0"/>
+  </w:num>
+</w:numbering>
 </file>
 
 <file path=word/people.xml><?xml version="1.0" encoding="utf-8"?>
 <w15:people xmlns:wpc="http://schemas.microsoft.com/office/word/2010/wordprocessingCanvas" xmlns:cx="http://schemas.microsoft.com/office/drawing/2014/chartex" xmlns:cx1="http://schemas.microsoft.com/office/drawing/2015/9/8/chartex" xmlns:cx2="http://schemas.microsoft.com/office/drawing/2015/10/21/chartex" xmlns:cx3="http://schemas.microsoft.com/office/drawing/2016/5/9/chartex" xmlns:cx4="http://schemas.microsoft.com/office/drawing/2016/5/10/chartex" xmlns:cx5="http://schemas.microsoft.com/office/drawing/2016/5/11/chartex" xmlns:cx6="http://schemas.microsoft.com/office/drawing/2016/5/12/chartex" xmlns:cx7="http://schemas.microsoft.com/office/drawing/2016/5/13/chartex" xmlns:cx8="http://schemas.microsoft.com/office/drawing/2016/5/14/chartex" xmlns:mc="http://schemas.openxmlformats.org/markup-compatibility/2006" xmlns:aink="http://schemas.microsoft.com/office/drawing/2016/ink" xmlns:am3d="http://schemas.microsoft.com/office/drawing/2017/model3d" xmlns:o="urn:schemas-microsoft-com:office:office" xmlns:oel="http://schemas.microsoft.com/office/2019/extlst" xmlns:r="http://schemas.openxmlformats.org/officeDocument/2006/relationships" xmlns:m="http://schemas.openxmlformats.org/officeDocument/2006/math" xmlns:v="urn:schemas-microsoft-com:vml" xmlns:wp14="http://schemas.microsoft.com/office/word/2010/wordprocessingDrawing" xmlns:wp="http://schemas.openxmlformats.org/drawingml/2006/wordprocessingDrawing" xmlns:w10="urn:schemas-microsoft-com:office:word" xmlns:w="http://schemas.openxmlformats.org/wordprocessingml/2006/main" xmlns:w14="http://schemas.microsoft.com/office/word/2010/wordml" xmlns:w15="http://schemas.microsoft.com/office/word/2012/wordml" xmlns:w16cex="http://schemas.microsoft.com/office/word/2018/wordml/cex" xmlns:w16cid="http://schemas.microsoft.com/office/word/2016/wordml/cid" xmlns:w16="http://schemas.microsoft.com/office/word/2018/wordml" xmlns:w16du="http://schemas.microsoft.com/office/word/2023/wordml/word16du" xmlns:w16sdtdh="http://schemas.microsoft.com/office/word/2020/wordml/sdtdatahash" xmlns:w16sdtfl="http://schemas.microsoft.com/office/word/2024/wordml/sdtformatlock" xmlns:w16se="http://schemas.microsoft.com/office/word/2015/wordml/symex" xmlns:wpg="http://schemas.microsoft.com/office/word/2010/wordprocessingGroup" xmlns:wpi="http://schemas.microsoft.com/office/word/2010/wordprocessingInk" xmlns:wne="http://schemas.microsoft.com/office/word/2006/wordml" xmlns:wps="http://schemas.microsoft.com/office/word/2010/wordprocessingShape" mc:Ignorable="w14 w15 w16se w16cid w16 w16cex w16sdtdh w16sdtfl w16du wp14">
+  <w15:person w15:author="Daniel Noble">
+    <w15:presenceInfo w15:providerId="AD" w15:userId="S::u5062688@anu.edu.au::cd1442c4-8911-414d-88db-662b5685b55e"/>
+  </w15:person>
   <w15:person w15:author="Ondi Crino">
     <w15:presenceInfo w15:providerId="AD" w15:userId="S::crin0006@flinders.edu.au::14d01f18-b834-4109-ba44-5cbdcf7d2f8e"/>
   </w15:person>

</xml_diff>